<commit_message>
SE template: replace broken link under relevant policies and guidelines
</commit_message>
<xml_diff>
--- a/src/main/resources/org/damap/base/template/scienceEuropeTemplate.docx
+++ b/src/main/resources/org/damap/base/template/scienceEuropeTemplate.docx
@@ -28,27 +28,27 @@
     </w:p>
     <w:p>
       <w:pPr>
-        <w:pStyle w:val="Heading3"/>
+        <w:pStyle w:val="berschrift3"/>
       </w:pPr>
     </w:p>
     <w:p>
       <w:pPr>
-        <w:pStyle w:val="Heading3"/>
+        <w:pStyle w:val="berschrift3"/>
       </w:pPr>
     </w:p>
     <w:p>
       <w:pPr>
-        <w:pStyle w:val="Heading3"/>
+        <w:pStyle w:val="berschrift3"/>
       </w:pPr>
     </w:p>
     <w:p>
       <w:pPr>
-        <w:pStyle w:val="Heading3"/>
+        <w:pStyle w:val="berschrift3"/>
       </w:pPr>
     </w:p>
     <w:p>
       <w:pPr>
-        <w:pStyle w:val="Heading3"/>
+        <w:pStyle w:val="berschrift3"/>
       </w:pPr>
       <w:r>
         <w:t>You are almost there!</w:t>
@@ -436,7 +436,7 @@
     </w:p>
     <w:p>
       <w:pPr>
-        <w:pStyle w:val="Title"/>
+        <w:pStyle w:val="Titel"/>
         <w:tabs>
           <w:tab w:val="left" w:pos="2847"/>
         </w:tabs>
@@ -466,7 +466,7 @@
     </w:p>
     <w:p>
       <w:pPr>
-        <w:pStyle w:val="Title"/>
+        <w:pStyle w:val="Titel"/>
         <w:spacing w:after="840"/>
         <w:jc w:val="center"/>
         <w:rPr>
@@ -2573,7 +2573,7 @@
       <w:sdtContent>
         <w:p>
           <w:pPr>
-            <w:pStyle w:val="TOC1"/>
+            <w:pStyle w:val="Verzeichnis1"/>
             <w:rPr>
               <w:rFonts w:asciiTheme="minorHAnsi" w:eastAsiaTheme="minorEastAsia" w:hAnsiTheme="minorHAnsi" w:cstheme="minorBidi"/>
               <w:caps w:val="0"/>
@@ -2620,7 +2620,7 @@
         </w:p>
         <w:p>
           <w:pPr>
-            <w:pStyle w:val="TOC3"/>
+            <w:pStyle w:val="Verzeichnis3"/>
             <w:rPr>
               <w:rFonts w:asciiTheme="minorHAnsi" w:eastAsiaTheme="minorEastAsia" w:hAnsiTheme="minorHAnsi" w:cstheme="minorBidi"/>
               <w:lang w:val="de-AT" w:eastAsia="de-AT"/>
@@ -2655,7 +2655,7 @@
         </w:p>
         <w:p>
           <w:pPr>
-            <w:pStyle w:val="TOC3"/>
+            <w:pStyle w:val="Verzeichnis3"/>
             <w:rPr>
               <w:rFonts w:asciiTheme="minorHAnsi" w:eastAsiaTheme="minorEastAsia" w:hAnsiTheme="minorHAnsi" w:cstheme="minorBidi"/>
               <w:lang w:val="de-AT" w:eastAsia="de-AT"/>
@@ -2690,7 +2690,7 @@
         </w:p>
         <w:p>
           <w:pPr>
-            <w:pStyle w:val="TOC1"/>
+            <w:pStyle w:val="Verzeichnis1"/>
             <w:rPr>
               <w:rFonts w:asciiTheme="minorHAnsi" w:eastAsiaTheme="minorEastAsia" w:hAnsiTheme="minorHAnsi" w:cstheme="minorBidi"/>
               <w:caps w:val="0"/>
@@ -2768,7 +2768,7 @@
         </w:p>
         <w:p>
           <w:pPr>
-            <w:pStyle w:val="TOC3"/>
+            <w:pStyle w:val="Verzeichnis3"/>
             <w:rPr>
               <w:rFonts w:asciiTheme="minorHAnsi" w:eastAsiaTheme="minorEastAsia" w:hAnsiTheme="minorHAnsi" w:cstheme="minorBidi"/>
               <w:lang w:val="de-AT" w:eastAsia="de-AT"/>
@@ -2841,7 +2841,7 @@
         </w:p>
         <w:p>
           <w:pPr>
-            <w:pStyle w:val="TOC3"/>
+            <w:pStyle w:val="Verzeichnis3"/>
             <w:rPr>
               <w:rFonts w:asciiTheme="minorHAnsi" w:eastAsiaTheme="minorEastAsia" w:hAnsiTheme="minorHAnsi" w:cstheme="minorBidi"/>
               <w:lang w:val="de-AT" w:eastAsia="de-AT"/>
@@ -2914,7 +2914,7 @@
         </w:p>
         <w:p>
           <w:pPr>
-            <w:pStyle w:val="TOC1"/>
+            <w:pStyle w:val="Verzeichnis1"/>
             <w:rPr>
               <w:rFonts w:asciiTheme="minorHAnsi" w:eastAsiaTheme="minorEastAsia" w:hAnsiTheme="minorHAnsi" w:cstheme="minorBidi"/>
               <w:caps w:val="0"/>
@@ -2993,7 +2993,7 @@
         </w:p>
         <w:p>
           <w:pPr>
-            <w:pStyle w:val="TOC3"/>
+            <w:pStyle w:val="Verzeichnis3"/>
             <w:rPr>
               <w:rFonts w:asciiTheme="minorHAnsi" w:eastAsiaTheme="minorEastAsia" w:hAnsiTheme="minorHAnsi" w:cstheme="minorBidi"/>
               <w:lang w:val="de-AT" w:eastAsia="de-AT"/>
@@ -3066,7 +3066,7 @@
         </w:p>
         <w:p>
           <w:pPr>
-            <w:pStyle w:val="TOC3"/>
+            <w:pStyle w:val="Verzeichnis3"/>
             <w:rPr>
               <w:rFonts w:asciiTheme="minorHAnsi" w:eastAsiaTheme="minorEastAsia" w:hAnsiTheme="minorHAnsi" w:cstheme="minorBidi"/>
               <w:lang w:val="de-AT" w:eastAsia="de-AT"/>
@@ -3139,7 +3139,7 @@
         </w:p>
         <w:p>
           <w:pPr>
-            <w:pStyle w:val="TOC1"/>
+            <w:pStyle w:val="Verzeichnis1"/>
             <w:rPr>
               <w:rFonts w:asciiTheme="minorHAnsi" w:eastAsiaTheme="minorEastAsia" w:hAnsiTheme="minorHAnsi" w:cstheme="minorBidi"/>
               <w:caps w:val="0"/>
@@ -3218,7 +3218,7 @@
         </w:p>
         <w:p>
           <w:pPr>
-            <w:pStyle w:val="TOC3"/>
+            <w:pStyle w:val="Verzeichnis3"/>
             <w:rPr>
               <w:rFonts w:asciiTheme="minorHAnsi" w:eastAsiaTheme="minorEastAsia" w:hAnsiTheme="minorHAnsi" w:cstheme="minorBidi"/>
               <w:lang w:val="de-AT" w:eastAsia="de-AT"/>
@@ -3291,7 +3291,7 @@
         </w:p>
         <w:p>
           <w:pPr>
-            <w:pStyle w:val="TOC3"/>
+            <w:pStyle w:val="Verzeichnis3"/>
             <w:rPr>
               <w:rFonts w:asciiTheme="minorHAnsi" w:eastAsiaTheme="minorEastAsia" w:hAnsiTheme="minorHAnsi" w:cstheme="minorBidi"/>
               <w:lang w:val="de-AT" w:eastAsia="de-AT"/>
@@ -3364,7 +3364,7 @@
         </w:p>
         <w:p>
           <w:pPr>
-            <w:pStyle w:val="TOC1"/>
+            <w:pStyle w:val="Verzeichnis1"/>
             <w:rPr>
               <w:rFonts w:asciiTheme="minorHAnsi" w:eastAsiaTheme="minorEastAsia" w:hAnsiTheme="minorHAnsi" w:cstheme="minorBidi"/>
               <w:caps w:val="0"/>
@@ -3443,7 +3443,7 @@
         </w:p>
         <w:p>
           <w:pPr>
-            <w:pStyle w:val="TOC3"/>
+            <w:pStyle w:val="Verzeichnis3"/>
             <w:rPr>
               <w:rFonts w:asciiTheme="minorHAnsi" w:eastAsiaTheme="minorEastAsia" w:hAnsiTheme="minorHAnsi" w:cstheme="minorBidi"/>
               <w:lang w:val="de-AT" w:eastAsia="de-AT"/>
@@ -3516,7 +3516,7 @@
         </w:p>
         <w:p>
           <w:pPr>
-            <w:pStyle w:val="TOC3"/>
+            <w:pStyle w:val="Verzeichnis3"/>
             <w:rPr>
               <w:rFonts w:asciiTheme="minorHAnsi" w:eastAsiaTheme="minorEastAsia" w:hAnsiTheme="minorHAnsi" w:cstheme="minorBidi"/>
               <w:lang w:val="de-AT" w:eastAsia="de-AT"/>
@@ -3589,7 +3589,7 @@
         </w:p>
         <w:p>
           <w:pPr>
-            <w:pStyle w:val="TOC3"/>
+            <w:pStyle w:val="Verzeichnis3"/>
             <w:rPr>
               <w:rFonts w:asciiTheme="minorHAnsi" w:eastAsiaTheme="minorEastAsia" w:hAnsiTheme="minorHAnsi" w:cstheme="minorBidi"/>
               <w:lang w:val="de-AT" w:eastAsia="de-AT"/>
@@ -3662,7 +3662,7 @@
         </w:p>
         <w:p>
           <w:pPr>
-            <w:pStyle w:val="TOC1"/>
+            <w:pStyle w:val="Verzeichnis1"/>
             <w:rPr>
               <w:rFonts w:asciiTheme="minorHAnsi" w:eastAsiaTheme="minorEastAsia" w:hAnsiTheme="minorHAnsi" w:cstheme="minorBidi"/>
               <w:caps w:val="0"/>
@@ -3741,7 +3741,7 @@
         </w:p>
         <w:p>
           <w:pPr>
-            <w:pStyle w:val="TOC3"/>
+            <w:pStyle w:val="Verzeichnis3"/>
             <w:rPr>
               <w:rFonts w:asciiTheme="minorHAnsi" w:eastAsiaTheme="minorEastAsia" w:hAnsiTheme="minorHAnsi" w:cstheme="minorBidi"/>
               <w:lang w:val="de-AT" w:eastAsia="de-AT"/>
@@ -3814,7 +3814,7 @@
         </w:p>
         <w:p>
           <w:pPr>
-            <w:pStyle w:val="TOC3"/>
+            <w:pStyle w:val="Verzeichnis3"/>
             <w:rPr>
               <w:rFonts w:asciiTheme="minorHAnsi" w:eastAsiaTheme="minorEastAsia" w:hAnsiTheme="minorHAnsi" w:cstheme="minorBidi"/>
               <w:lang w:val="de-AT" w:eastAsia="de-AT"/>
@@ -3887,7 +3887,7 @@
         </w:p>
         <w:p>
           <w:pPr>
-            <w:pStyle w:val="TOC1"/>
+            <w:pStyle w:val="Verzeichnis1"/>
             <w:rPr>
               <w:rFonts w:asciiTheme="minorHAnsi" w:eastAsiaTheme="minorEastAsia" w:hAnsiTheme="minorHAnsi" w:cstheme="minorBidi"/>
               <w:caps w:val="0"/>
@@ -3966,7 +3966,7 @@
         </w:p>
         <w:p>
           <w:pPr>
-            <w:pStyle w:val="TOC3"/>
+            <w:pStyle w:val="Verzeichnis3"/>
             <w:rPr>
               <w:rFonts w:asciiTheme="minorHAnsi" w:eastAsiaTheme="minorEastAsia" w:hAnsiTheme="minorHAnsi" w:cstheme="minorBidi"/>
               <w:lang w:val="de-AT" w:eastAsia="de-AT"/>
@@ -4039,7 +4039,7 @@
         </w:p>
         <w:p>
           <w:pPr>
-            <w:pStyle w:val="TOC3"/>
+            <w:pStyle w:val="Verzeichnis3"/>
             <w:rPr>
               <w:rFonts w:asciiTheme="minorHAnsi" w:eastAsiaTheme="minorEastAsia" w:hAnsiTheme="minorHAnsi" w:cstheme="minorBidi"/>
               <w:lang w:val="de-AT" w:eastAsia="de-AT"/>
@@ -4112,7 +4112,7 @@
         </w:p>
         <w:p>
           <w:pPr>
-            <w:pStyle w:val="TOC2"/>
+            <w:pStyle w:val="Verzeichnis2"/>
             <w:jc w:val="left"/>
             <w:rPr>
               <w:b/>
@@ -4140,7 +4140,7 @@
     </w:p>
     <w:p>
       <w:pPr>
-        <w:pStyle w:val="Heading1"/>
+        <w:pStyle w:val="berschrift1"/>
         <w:numPr>
           <w:ilvl w:val="0"/>
           <w:numId w:val="0"/>
@@ -4158,7 +4158,7 @@
     </w:p>
     <w:p>
       <w:pPr>
-        <w:pStyle w:val="Heading3"/>
+        <w:pStyle w:val="berschrift3"/>
         <w:jc w:val="both"/>
       </w:pPr>
       <w:bookmarkStart w:id="3" w:name="_Toc109653439"/>
@@ -4231,7 +4231,7 @@
     </w:p>
     <w:p>
       <w:pPr>
-        <w:pStyle w:val="ListParagraph"/>
+        <w:pStyle w:val="Listenabsatz"/>
         <w:numPr>
           <w:ilvl w:val="0"/>
           <w:numId w:val="30"/>
@@ -4251,7 +4251,7 @@
     </w:p>
     <w:p>
       <w:pPr>
-        <w:pStyle w:val="ListParagraph"/>
+        <w:pStyle w:val="Listenabsatz"/>
         <w:numPr>
           <w:ilvl w:val="0"/>
           <w:numId w:val="30"/>
@@ -4271,7 +4271,7 @@
     </w:p>
     <w:p>
       <w:pPr>
-        <w:pStyle w:val="ListParagraph"/>
+        <w:pStyle w:val="Listenabsatz"/>
         <w:numPr>
           <w:ilvl w:val="0"/>
           <w:numId w:val="30"/>
@@ -4291,7 +4291,7 @@
     </w:p>
     <w:p>
       <w:pPr>
-        <w:pStyle w:val="ListParagraph"/>
+        <w:pStyle w:val="Listenabsatz"/>
         <w:numPr>
           <w:ilvl w:val="0"/>
           <w:numId w:val="30"/>
@@ -4311,7 +4311,7 @@
     </w:p>
     <w:p>
       <w:pPr>
-        <w:pStyle w:val="Heading3"/>
+        <w:pStyle w:val="berschrift3"/>
       </w:pPr>
       <w:bookmarkStart w:id="4" w:name="_Toc109653440"/>
       <w:r>
@@ -4341,14 +4341,14 @@
         </w:rPr>
         <w:t xml:space="preserve">European Commission’s document on Ethics and Data Protection: </w:t>
       </w:r>
-      <w:hyperlink r:id="rId18" w:tooltip="https://ec.europa.eu/info/sites/info/files/5._h2020_ethics_and_data_protection.pdf" w:history="1">
+      <w:hyperlink r:id="rId18" w:history="1">
         <w:r>
           <w:rPr>
             <w:rStyle w:val="Hyperlink"/>
             <w:rFonts w:asciiTheme="minorHAnsi" w:eastAsiaTheme="minorEastAsia" w:hAnsiTheme="minorHAnsi" w:cstheme="minorBidi"/>
             <w:lang w:val="en-GB"/>
           </w:rPr>
-          <w:t>https://ec.europa.eu/info/sites/info/files/5._h2020_ethics_and_data_protection.pdf</w:t>
+          <w:t>https://ec.europa.eu/info/funding-tenders/opportunities/docs/2021-2027/horizon/guidance/ethics-and-data-protection_he_en.pdf</w:t>
         </w:r>
       </w:hyperlink>
     </w:p>
@@ -4389,7 +4389,7 @@
     </w:p>
     <w:p>
       <w:pPr>
-        <w:pStyle w:val="Heading1"/>
+        <w:pStyle w:val="berschrift1"/>
         <w:numPr>
           <w:ilvl w:val="0"/>
           <w:numId w:val="33"/>
@@ -4407,7 +4407,7 @@
     </w:p>
     <w:p>
       <w:pPr>
-        <w:pStyle w:val="Heading3"/>
+        <w:pStyle w:val="berschrift3"/>
       </w:pPr>
       <w:bookmarkStart w:id="6" w:name="_Toc109653442"/>
       <w:r>
@@ -5645,7 +5645,7 @@
     </w:p>
     <w:p>
       <w:pPr>
-        <w:pStyle w:val="Heading3"/>
+        <w:pStyle w:val="berschrift3"/>
       </w:pPr>
       <w:r>
         <w:rPr>
@@ -5722,7 +5722,7 @@
     </w:p>
     <w:p>
       <w:pPr>
-        <w:pStyle w:val="Heading1"/>
+        <w:pStyle w:val="berschrift1"/>
       </w:pPr>
       <w:bookmarkStart w:id="10" w:name="_Toc109653444"/>
       <w:r>
@@ -5735,7 +5735,7 @@
     </w:p>
     <w:p>
       <w:pPr>
-        <w:pStyle w:val="Heading3"/>
+        <w:pStyle w:val="berschrift3"/>
       </w:pPr>
       <w:bookmarkStart w:id="11" w:name="_Toc109653445"/>
       <w:bookmarkStart w:id="12" w:name="_Hlk39737467"/>
@@ -5845,7 +5845,7 @@
     </w:p>
     <w:p>
       <w:pPr>
-        <w:pStyle w:val="Heading3"/>
+        <w:pStyle w:val="berschrift3"/>
       </w:pPr>
       <w:bookmarkStart w:id="13" w:name="_Toc109653446"/>
       <w:r>
@@ -5899,7 +5899,7 @@
     </w:p>
     <w:p>
       <w:pPr>
-        <w:pStyle w:val="Heading1"/>
+        <w:pStyle w:val="berschrift1"/>
       </w:pPr>
       <w:bookmarkStart w:id="14" w:name="_Toc109653447"/>
       <w:r>
@@ -5912,7 +5912,7 @@
     </w:p>
     <w:p>
       <w:pPr>
-        <w:pStyle w:val="Heading3"/>
+        <w:pStyle w:val="berschrift3"/>
       </w:pPr>
       <w:bookmarkStart w:id="15" w:name="_Toc109653448"/>
       <w:bookmarkStart w:id="16" w:name="_Hlk40268397"/>
@@ -5977,7 +5977,7 @@
     </w:p>
     <w:p>
       <w:pPr>
-        <w:pStyle w:val="Heading3"/>
+        <w:pStyle w:val="berschrift3"/>
       </w:pPr>
       <w:bookmarkStart w:id="17" w:name="_Toc109653449"/>
       <w:r>
@@ -6468,7 +6468,7 @@
     </w:p>
     <w:p>
       <w:pPr>
-        <w:pStyle w:val="Heading1"/>
+        <w:pStyle w:val="berschrift1"/>
       </w:pPr>
       <w:bookmarkStart w:id="19" w:name="_Toc109653450"/>
       <w:bookmarkEnd w:id="16"/>
@@ -6482,7 +6482,7 @@
     </w:p>
     <w:p>
       <w:pPr>
-        <w:pStyle w:val="Heading3"/>
+        <w:pStyle w:val="berschrift3"/>
       </w:pPr>
       <w:bookmarkStart w:id="20" w:name="_Toc109653451"/>
       <w:bookmarkStart w:id="21" w:name="_Hlk40269153"/>
@@ -6534,7 +6534,7 @@
     </w:p>
     <w:p>
       <w:pPr>
-        <w:pStyle w:val="Heading3"/>
+        <w:pStyle w:val="berschrift3"/>
       </w:pPr>
       <w:bookmarkStart w:id="22" w:name="_Toc109653452"/>
       <w:r>
@@ -6590,7 +6590,7 @@
     </w:p>
     <w:p>
       <w:pPr>
-        <w:pStyle w:val="Heading3"/>
+        <w:pStyle w:val="berschrift3"/>
       </w:pPr>
       <w:bookmarkStart w:id="23" w:name="_Toc109653453"/>
       <w:r>
@@ -6640,7 +6640,7 @@
     </w:p>
     <w:p>
       <w:pPr>
-        <w:pStyle w:val="Heading1"/>
+        <w:pStyle w:val="berschrift1"/>
       </w:pPr>
       <w:bookmarkStart w:id="24" w:name="_Toc109653454"/>
       <w:r>
@@ -6653,7 +6653,7 @@
     </w:p>
     <w:p>
       <w:pPr>
-        <w:pStyle w:val="Heading3"/>
+        <w:pStyle w:val="berschrift3"/>
       </w:pPr>
       <w:bookmarkStart w:id="25" w:name="_Toc109653455"/>
       <w:r>
@@ -7340,7 +7340,7 @@
     </w:p>
     <w:p>
       <w:pPr>
-        <w:pStyle w:val="Heading3"/>
+        <w:pStyle w:val="berschrift3"/>
       </w:pPr>
       <w:bookmarkStart w:id="26" w:name="_Toc109653456"/>
       <w:r>
@@ -8217,7 +8217,7 @@
     </w:tbl>
     <w:p>
       <w:pPr>
-        <w:pStyle w:val="Heading1"/>
+        <w:pStyle w:val="berschrift1"/>
       </w:pPr>
       <w:bookmarkStart w:id="27" w:name="_Toc109653457"/>
       <w:r>
@@ -8230,7 +8230,7 @@
     </w:p>
     <w:p>
       <w:pPr>
-        <w:pStyle w:val="Heading3"/>
+        <w:pStyle w:val="berschrift3"/>
       </w:pPr>
       <w:bookmarkStart w:id="28" w:name="_Toc109653458"/>
       <w:r>
@@ -8304,7 +8304,7 @@
     </w:p>
     <w:p>
       <w:pPr>
-        <w:pStyle w:val="Heading3"/>
+        <w:pStyle w:val="berschrift3"/>
       </w:pPr>
       <w:bookmarkStart w:id="29" w:name="_Toc109653459"/>
       <w:r>
@@ -10596,7 +10596,7 @@
     <w:lvl w:ilvl="4" w:tplc="EA880DE0">
       <w:start w:val="1"/>
       <w:numFmt w:val="bullet"/>
-      <w:pStyle w:val="Heading5"/>
+      <w:pStyle w:val="berschrift5"/>
       <w:lvlText w:val="o"/>
       <w:lvlJc w:val="left"/>
       <w:pPr>
@@ -10609,7 +10609,7 @@
     <w:lvl w:ilvl="5" w:tplc="A948CE54">
       <w:start w:val="1"/>
       <w:numFmt w:val="bullet"/>
-      <w:pStyle w:val="Heading6"/>
+      <w:pStyle w:val="berschrift6"/>
       <w:lvlText w:val="▪"/>
       <w:lvlJc w:val="left"/>
       <w:pPr>
@@ -10622,7 +10622,7 @@
     <w:lvl w:ilvl="6" w:tplc="E5CA116C">
       <w:start w:val="1"/>
       <w:numFmt w:val="bullet"/>
-      <w:pStyle w:val="Heading7"/>
+      <w:pStyle w:val="berschrift7"/>
       <w:lvlText w:val="●"/>
       <w:lvlJc w:val="left"/>
       <w:pPr>
@@ -10635,7 +10635,7 @@
     <w:lvl w:ilvl="7" w:tplc="B7801C62">
       <w:start w:val="1"/>
       <w:numFmt w:val="bullet"/>
-      <w:pStyle w:val="Heading8"/>
+      <w:pStyle w:val="berschrift8"/>
       <w:lvlText w:val="o"/>
       <w:lvlJc w:val="left"/>
       <w:pPr>
@@ -10648,7 +10648,7 @@
     <w:lvl w:ilvl="8" w:tplc="4650DF5C">
       <w:start w:val="1"/>
       <w:numFmt w:val="bullet"/>
-      <w:pStyle w:val="Heading9"/>
+      <w:pStyle w:val="berschrift9"/>
       <w:lvlText w:val="▪"/>
       <w:lvlJc w:val="left"/>
       <w:pPr>
@@ -12823,7 +12823,7 @@
     <w:lvl w:ilvl="0" w:tplc="11F8C572">
       <w:start w:val="1"/>
       <w:numFmt w:val="decimal"/>
-      <w:pStyle w:val="Heading1"/>
+      <w:pStyle w:val="berschrift1"/>
       <w:lvlText w:val="%1."/>
       <w:lvlJc w:val="left"/>
       <w:pPr>
@@ -13866,7 +13866,7 @@
     <w:lsdException w:name="Unresolved Mention" w:semiHidden="1" w:unhideWhenUsed="1"/>
     <w:lsdException w:name="Smart Link" w:semiHidden="1" w:unhideWhenUsed="1"/>
   </w:latentStyles>
-  <w:style w:type="paragraph" w:default="1" w:styleId="Normal">
+  <w:style w:type="paragraph" w:default="1" w:styleId="Standard">
     <w:name w:val="Normal"/>
     <w:qFormat/>
     <w:rsid w:val="009470E7"/>
@@ -13879,11 +13879,11 @@
       <w:lang w:val="de-DE" w:eastAsia="en-US"/>
     </w:rPr>
   </w:style>
-  <w:style w:type="paragraph" w:styleId="Heading1">
+  <w:style w:type="paragraph" w:styleId="berschrift1">
     <w:name w:val="heading 1"/>
-    <w:basedOn w:val="Normal"/>
-    <w:next w:val="Normal"/>
-    <w:link w:val="Heading1Char1"/>
+    <w:basedOn w:val="Standard"/>
+    <w:next w:val="Standard"/>
+    <w:link w:val="berschrift1Zchn"/>
     <w:uiPriority w:val="9"/>
     <w:qFormat/>
     <w:pPr>
@@ -13905,11 +13905,11 @@
       <w:lang w:val="en-GB"/>
     </w:rPr>
   </w:style>
-  <w:style w:type="paragraph" w:styleId="Heading2">
+  <w:style w:type="paragraph" w:styleId="berschrift2">
     <w:name w:val="heading 2"/>
-    <w:basedOn w:val="Normal"/>
-    <w:next w:val="Normal"/>
-    <w:link w:val="Heading2Char1"/>
+    <w:basedOn w:val="Standard"/>
+    <w:next w:val="Standard"/>
+    <w:link w:val="berschrift2Zchn"/>
     <w:uiPriority w:val="9"/>
     <w:unhideWhenUsed/>
     <w:qFormat/>
@@ -13931,10 +13931,10 @@
       <w:lang w:val="en-US"/>
     </w:rPr>
   </w:style>
-  <w:style w:type="paragraph" w:styleId="Heading3">
+  <w:style w:type="paragraph" w:styleId="berschrift3">
     <w:name w:val="heading 3"/>
-    <w:next w:val="Normal"/>
-    <w:link w:val="Heading3Char1"/>
+    <w:next w:val="Standard"/>
+    <w:link w:val="berschrift3Zchn"/>
     <w:uiPriority w:val="9"/>
     <w:unhideWhenUsed/>
     <w:qFormat/>
@@ -13952,11 +13952,11 @@
       <w:lang w:val="en-GB" w:eastAsia="en-US"/>
     </w:rPr>
   </w:style>
-  <w:style w:type="paragraph" w:styleId="Heading4">
+  <w:style w:type="paragraph" w:styleId="berschrift4">
     <w:name w:val="heading 4"/>
-    <w:basedOn w:val="Normal"/>
-    <w:next w:val="Normal"/>
-    <w:link w:val="Heading4Char1"/>
+    <w:basedOn w:val="Standard"/>
+    <w:next w:val="Standard"/>
+    <w:link w:val="berschrift4Zchn"/>
     <w:uiPriority w:val="9"/>
     <w:unhideWhenUsed/>
     <w:qFormat/>
@@ -13982,11 +13982,11 @@
       <w:lang w:val="en-GB"/>
     </w:rPr>
   </w:style>
-  <w:style w:type="paragraph" w:styleId="Heading5">
+  <w:style w:type="paragraph" w:styleId="berschrift5">
     <w:name w:val="heading 5"/>
-    <w:basedOn w:val="Normal"/>
-    <w:next w:val="Normal"/>
-    <w:link w:val="Heading5Char1"/>
+    <w:basedOn w:val="Standard"/>
+    <w:next w:val="Standard"/>
+    <w:link w:val="berschrift5Zchn"/>
     <w:uiPriority w:val="9"/>
     <w:semiHidden/>
     <w:unhideWhenUsed/>
@@ -14008,11 +14008,11 @@
       <w:szCs w:val="20"/>
     </w:rPr>
   </w:style>
-  <w:style w:type="paragraph" w:styleId="Heading6">
+  <w:style w:type="paragraph" w:styleId="berschrift6">
     <w:name w:val="heading 6"/>
-    <w:basedOn w:val="Normal"/>
-    <w:next w:val="Normal"/>
-    <w:link w:val="Heading6Char1"/>
+    <w:basedOn w:val="Standard"/>
+    <w:next w:val="Standard"/>
+    <w:link w:val="berschrift6Zchn"/>
     <w:uiPriority w:val="9"/>
     <w:semiHidden/>
     <w:unhideWhenUsed/>
@@ -14036,11 +14036,11 @@
       <w:szCs w:val="20"/>
     </w:rPr>
   </w:style>
-  <w:style w:type="paragraph" w:styleId="Heading7">
+  <w:style w:type="paragraph" w:styleId="berschrift7">
     <w:name w:val="heading 7"/>
-    <w:basedOn w:val="Normal"/>
-    <w:next w:val="Normal"/>
-    <w:link w:val="Heading7Char1"/>
+    <w:basedOn w:val="Standard"/>
+    <w:next w:val="Standard"/>
+    <w:link w:val="berschrift7Zchn"/>
     <w:uiPriority w:val="9"/>
     <w:semiHidden/>
     <w:unhideWhenUsed/>
@@ -14064,11 +14064,11 @@
       <w:szCs w:val="20"/>
     </w:rPr>
   </w:style>
-  <w:style w:type="paragraph" w:styleId="Heading8">
+  <w:style w:type="paragraph" w:styleId="berschrift8">
     <w:name w:val="heading 8"/>
-    <w:basedOn w:val="Normal"/>
-    <w:next w:val="Normal"/>
-    <w:link w:val="Heading8Char1"/>
+    <w:basedOn w:val="Standard"/>
+    <w:next w:val="Standard"/>
+    <w:link w:val="berschrift8Zchn"/>
     <w:uiPriority w:val="9"/>
     <w:semiHidden/>
     <w:unhideWhenUsed/>
@@ -14090,11 +14090,11 @@
       <w:szCs w:val="20"/>
     </w:rPr>
   </w:style>
-  <w:style w:type="paragraph" w:styleId="Heading9">
+  <w:style w:type="paragraph" w:styleId="berschrift9">
     <w:name w:val="heading 9"/>
-    <w:basedOn w:val="Normal"/>
-    <w:next w:val="Normal"/>
-    <w:link w:val="Heading9Char1"/>
+    <w:basedOn w:val="Standard"/>
+    <w:next w:val="Standard"/>
+    <w:link w:val="berschrift9Zchn"/>
     <w:uiPriority w:val="9"/>
     <w:semiHidden/>
     <w:unhideWhenUsed/>
@@ -14118,13 +14118,13 @@
       <w:szCs w:val="20"/>
     </w:rPr>
   </w:style>
-  <w:style w:type="character" w:default="1" w:styleId="DefaultParagraphFont">
+  <w:style w:type="character" w:default="1" w:styleId="Absatz-Standardschriftart">
     <w:name w:val="Default Paragraph Font"/>
     <w:uiPriority w:val="1"/>
     <w:semiHidden/>
     <w:unhideWhenUsed/>
   </w:style>
-  <w:style w:type="table" w:default="1" w:styleId="TableNormal">
+  <w:style w:type="table" w:default="1" w:styleId="NormaleTabelle">
     <w:name w:val="Normal Table"/>
     <w:uiPriority w:val="99"/>
     <w:semiHidden/>
@@ -14139,7 +14139,7 @@
       </w:tblCellMar>
     </w:tblPr>
   </w:style>
-  <w:style w:type="numbering" w:default="1" w:styleId="NoList">
+  <w:style w:type="numbering" w:default="1" w:styleId="KeineListe">
     <w:name w:val="No List"/>
     <w:uiPriority w:val="99"/>
     <w:semiHidden/>
@@ -14147,7 +14147,7 @@
   </w:style>
   <w:style w:type="character" w:customStyle="1" w:styleId="Heading1Char">
     <w:name w:val="Heading 1 Char"/>
-    <w:basedOn w:val="DefaultParagraphFont"/>
+    <w:basedOn w:val="Absatz-Standardschriftart"/>
     <w:uiPriority w:val="9"/>
     <w:rPr>
       <w:rFonts w:ascii="Arial" w:eastAsia="Arial" w:hAnsi="Arial" w:cs="Arial"/>
@@ -14157,7 +14157,7 @@
   </w:style>
   <w:style w:type="character" w:customStyle="1" w:styleId="Heading2Char">
     <w:name w:val="Heading 2 Char"/>
-    <w:basedOn w:val="DefaultParagraphFont"/>
+    <w:basedOn w:val="Absatz-Standardschriftart"/>
     <w:uiPriority w:val="9"/>
     <w:rPr>
       <w:rFonts w:ascii="Arial" w:eastAsia="Arial" w:hAnsi="Arial" w:cs="Arial"/>
@@ -14166,7 +14166,7 @@
   </w:style>
   <w:style w:type="character" w:customStyle="1" w:styleId="Heading3Char">
     <w:name w:val="Heading 3 Char"/>
-    <w:basedOn w:val="DefaultParagraphFont"/>
+    <w:basedOn w:val="Absatz-Standardschriftart"/>
     <w:uiPriority w:val="9"/>
     <w:rPr>
       <w:rFonts w:ascii="Arial" w:eastAsia="Arial" w:hAnsi="Arial" w:cs="Arial"/>
@@ -14176,7 +14176,7 @@
   </w:style>
   <w:style w:type="character" w:customStyle="1" w:styleId="Heading4Char">
     <w:name w:val="Heading 4 Char"/>
-    <w:basedOn w:val="DefaultParagraphFont"/>
+    <w:basedOn w:val="Absatz-Standardschriftart"/>
     <w:uiPriority w:val="9"/>
     <w:rPr>
       <w:rFonts w:ascii="Arial" w:eastAsia="Arial" w:hAnsi="Arial" w:cs="Arial"/>
@@ -14188,7 +14188,7 @@
   </w:style>
   <w:style w:type="character" w:customStyle="1" w:styleId="Heading5Char">
     <w:name w:val="Heading 5 Char"/>
-    <w:basedOn w:val="DefaultParagraphFont"/>
+    <w:basedOn w:val="Absatz-Standardschriftart"/>
     <w:uiPriority w:val="9"/>
     <w:rPr>
       <w:rFonts w:ascii="Arial" w:eastAsia="Arial" w:hAnsi="Arial" w:cs="Arial"/>
@@ -14200,7 +14200,7 @@
   </w:style>
   <w:style w:type="character" w:customStyle="1" w:styleId="Heading6Char">
     <w:name w:val="Heading 6 Char"/>
-    <w:basedOn w:val="DefaultParagraphFont"/>
+    <w:basedOn w:val="Absatz-Standardschriftart"/>
     <w:uiPriority w:val="9"/>
     <w:rPr>
       <w:rFonts w:ascii="Arial" w:eastAsia="Arial" w:hAnsi="Arial" w:cs="Arial"/>
@@ -14212,7 +14212,7 @@
   </w:style>
   <w:style w:type="character" w:customStyle="1" w:styleId="Heading7Char">
     <w:name w:val="Heading 7 Char"/>
-    <w:basedOn w:val="DefaultParagraphFont"/>
+    <w:basedOn w:val="Absatz-Standardschriftart"/>
     <w:uiPriority w:val="9"/>
     <w:rPr>
       <w:rFonts w:ascii="Arial" w:eastAsia="Arial" w:hAnsi="Arial" w:cs="Arial"/>
@@ -14226,7 +14226,7 @@
   </w:style>
   <w:style w:type="character" w:customStyle="1" w:styleId="Heading8Char">
     <w:name w:val="Heading 8 Char"/>
-    <w:basedOn w:val="DefaultParagraphFont"/>
+    <w:basedOn w:val="Absatz-Standardschriftart"/>
     <w:uiPriority w:val="9"/>
     <w:rPr>
       <w:rFonts w:ascii="Arial" w:eastAsia="Arial" w:hAnsi="Arial" w:cs="Arial"/>
@@ -14238,7 +14238,7 @@
   </w:style>
   <w:style w:type="character" w:customStyle="1" w:styleId="Heading9Char">
     <w:name w:val="Heading 9 Char"/>
-    <w:basedOn w:val="DefaultParagraphFont"/>
+    <w:basedOn w:val="Absatz-Standardschriftart"/>
     <w:uiPriority w:val="9"/>
     <w:rPr>
       <w:rFonts w:ascii="Arial" w:eastAsia="Arial" w:hAnsi="Arial" w:cs="Arial"/>
@@ -14250,28 +14250,28 @@
   </w:style>
   <w:style w:type="character" w:customStyle="1" w:styleId="TitleChar">
     <w:name w:val="Title Char"/>
-    <w:basedOn w:val="DefaultParagraphFont"/>
+    <w:basedOn w:val="Absatz-Standardschriftart"/>
     <w:uiPriority w:val="10"/>
     <w:rPr>
       <w:sz w:val="48"/>
       <w:szCs w:val="48"/>
     </w:rPr>
   </w:style>
-  <w:style w:type="character" w:customStyle="1" w:styleId="SubtitleChar">
-    <w:name w:val="Subtitle Char"/>
-    <w:basedOn w:val="DefaultParagraphFont"/>
-    <w:link w:val="Subtitle"/>
+  <w:style w:type="character" w:customStyle="1" w:styleId="UntertitelZchn">
+    <w:name w:val="Untertitel Zchn"/>
+    <w:basedOn w:val="Absatz-Standardschriftart"/>
+    <w:link w:val="Untertitel"/>
     <w:uiPriority w:val="11"/>
     <w:rPr>
       <w:sz w:val="24"/>
       <w:szCs w:val="24"/>
     </w:rPr>
   </w:style>
-  <w:style w:type="paragraph" w:styleId="Quote">
+  <w:style w:type="paragraph" w:styleId="Zitat">
     <w:name w:val="Quote"/>
-    <w:basedOn w:val="Normal"/>
-    <w:next w:val="Normal"/>
-    <w:link w:val="QuoteChar"/>
+    <w:basedOn w:val="Standard"/>
+    <w:next w:val="Standard"/>
+    <w:link w:val="ZitatZchn"/>
     <w:uiPriority w:val="29"/>
     <w:qFormat/>
     <w:pPr>
@@ -14281,19 +14281,19 @@
       <w:i/>
     </w:rPr>
   </w:style>
-  <w:style w:type="character" w:customStyle="1" w:styleId="QuoteChar">
-    <w:name w:val="Quote Char"/>
-    <w:link w:val="Quote"/>
+  <w:style w:type="character" w:customStyle="1" w:styleId="ZitatZchn">
+    <w:name w:val="Zitat Zchn"/>
+    <w:link w:val="Zitat"/>
     <w:uiPriority w:val="29"/>
     <w:rPr>
       <w:i/>
     </w:rPr>
   </w:style>
-  <w:style w:type="paragraph" w:styleId="IntenseQuote">
+  <w:style w:type="paragraph" w:styleId="IntensivesZitat">
     <w:name w:val="Intense Quote"/>
-    <w:basedOn w:val="Normal"/>
-    <w:next w:val="Normal"/>
-    <w:link w:val="IntenseQuoteChar"/>
+    <w:basedOn w:val="Standard"/>
+    <w:next w:val="Standard"/>
+    <w:link w:val="IntensivesZitatZchn"/>
     <w:uiPriority w:val="30"/>
     <w:qFormat/>
     <w:pPr>
@@ -14310,9 +14310,9 @@
       <w:i/>
     </w:rPr>
   </w:style>
-  <w:style w:type="character" w:customStyle="1" w:styleId="IntenseQuoteChar">
-    <w:name w:val="Intense Quote Char"/>
-    <w:link w:val="IntenseQuote"/>
+  <w:style w:type="character" w:customStyle="1" w:styleId="IntensivesZitatZchn">
+    <w:name w:val="Intensives Zitat Zchn"/>
+    <w:link w:val="IntensivesZitat"/>
     <w:uiPriority w:val="30"/>
     <w:rPr>
       <w:i/>
@@ -14320,12 +14320,12 @@
   </w:style>
   <w:style w:type="character" w:customStyle="1" w:styleId="HeaderChar">
     <w:name w:val="Header Char"/>
-    <w:basedOn w:val="DefaultParagraphFont"/>
+    <w:basedOn w:val="Absatz-Standardschriftart"/>
     <w:uiPriority w:val="99"/>
   </w:style>
   <w:style w:type="character" w:customStyle="1" w:styleId="FooterChar">
     <w:name w:val="Footer Char"/>
-    <w:basedOn w:val="DefaultParagraphFont"/>
+    <w:basedOn w:val="Absatz-Standardschriftart"/>
     <w:uiPriority w:val="99"/>
   </w:style>
   <w:style w:type="character" w:customStyle="1" w:styleId="CaptionChar">
@@ -14334,7 +14334,7 @@
   </w:style>
   <w:style w:type="table" w:customStyle="1" w:styleId="TableGridLight1">
     <w:name w:val="Table Grid Light1"/>
-    <w:basedOn w:val="TableNormal"/>
+    <w:basedOn w:val="NormaleTabelle"/>
     <w:uiPriority w:val="59"/>
     <w:pPr>
       <w:spacing w:after="0"/>
@@ -14350,9 +14350,9 @@
       </w:tblBorders>
     </w:tblPr>
   </w:style>
-  <w:style w:type="table" w:styleId="PlainTable1">
+  <w:style w:type="table" w:styleId="EinfacheTabelle1">
     <w:name w:val="Plain Table 1"/>
-    <w:basedOn w:val="TableNormal"/>
+    <w:basedOn w:val="NormaleTabelle"/>
     <w:uiPriority w:val="59"/>
     <w:pPr>
       <w:spacing w:after="0"/>
@@ -14412,9 +14412,9 @@
       </w:tcPr>
     </w:tblStylePr>
   </w:style>
-  <w:style w:type="table" w:styleId="PlainTable2">
+  <w:style w:type="table" w:styleId="EinfacheTabelle2">
     <w:name w:val="Plain Table 2"/>
-    <w:basedOn w:val="TableNormal"/>
+    <w:basedOn w:val="NormaleTabelle"/>
     <w:uiPriority w:val="59"/>
     <w:pPr>
       <w:spacing w:after="0"/>
@@ -14494,9 +14494,9 @@
       </w:tcPr>
     </w:tblStylePr>
   </w:style>
-  <w:style w:type="table" w:styleId="PlainTable3">
+  <w:style w:type="table" w:styleId="EinfacheTabelle3">
     <w:name w:val="Plain Table 3"/>
-    <w:basedOn w:val="TableNormal"/>
+    <w:basedOn w:val="NormaleTabelle"/>
     <w:uiPriority w:val="99"/>
     <w:pPr>
       <w:spacing w:after="0"/>
@@ -14574,9 +14574,9 @@
       </w:tcPr>
     </w:tblStylePr>
   </w:style>
-  <w:style w:type="table" w:styleId="PlainTable4">
+  <w:style w:type="table" w:styleId="EinfacheTabelle4">
     <w:name w:val="Plain Table 4"/>
-    <w:basedOn w:val="TableNormal"/>
+    <w:basedOn w:val="NormaleTabelle"/>
     <w:uiPriority w:val="99"/>
     <w:pPr>
       <w:spacing w:after="0"/>
@@ -14632,9 +14632,9 @@
       </w:tcPr>
     </w:tblStylePr>
   </w:style>
-  <w:style w:type="table" w:styleId="PlainTable5">
+  <w:style w:type="table" w:styleId="EinfacheTabelle5">
     <w:name w:val="Plain Table 5"/>
-    <w:basedOn w:val="TableNormal"/>
+    <w:basedOn w:val="NormaleTabelle"/>
     <w:uiPriority w:val="99"/>
     <w:pPr>
       <w:spacing w:after="0"/>
@@ -14727,7 +14727,7 @@
   </w:style>
   <w:style w:type="table" w:customStyle="1" w:styleId="GridTable1Light-Accent11">
     <w:name w:val="Grid Table 1 Light - Accent 11"/>
-    <w:basedOn w:val="TableNormal"/>
+    <w:basedOn w:val="NormaleTabelle"/>
     <w:uiPriority w:val="99"/>
     <w:pPr>
       <w:spacing w:after="0"/>
@@ -14793,7 +14793,7 @@
   </w:style>
   <w:style w:type="table" w:customStyle="1" w:styleId="GridTable1Light-Accent21">
     <w:name w:val="Grid Table 1 Light - Accent 21"/>
-    <w:basedOn w:val="TableNormal"/>
+    <w:basedOn w:val="NormaleTabelle"/>
     <w:uiPriority w:val="99"/>
     <w:pPr>
       <w:spacing w:after="0"/>
@@ -14859,7 +14859,7 @@
   </w:style>
   <w:style w:type="table" w:customStyle="1" w:styleId="GridTable1Light-Accent31">
     <w:name w:val="Grid Table 1 Light - Accent 31"/>
-    <w:basedOn w:val="TableNormal"/>
+    <w:basedOn w:val="NormaleTabelle"/>
     <w:uiPriority w:val="99"/>
     <w:pPr>
       <w:spacing w:after="0"/>
@@ -14925,7 +14925,7 @@
   </w:style>
   <w:style w:type="table" w:customStyle="1" w:styleId="GridTable1Light-Accent41">
     <w:name w:val="Grid Table 1 Light - Accent 41"/>
-    <w:basedOn w:val="TableNormal"/>
+    <w:basedOn w:val="NormaleTabelle"/>
     <w:uiPriority w:val="99"/>
     <w:pPr>
       <w:spacing w:after="0"/>
@@ -14991,7 +14991,7 @@
   </w:style>
   <w:style w:type="table" w:customStyle="1" w:styleId="GridTable1Light-Accent51">
     <w:name w:val="Grid Table 1 Light - Accent 51"/>
-    <w:basedOn w:val="TableNormal"/>
+    <w:basedOn w:val="NormaleTabelle"/>
     <w:uiPriority w:val="99"/>
     <w:pPr>
       <w:spacing w:after="0"/>
@@ -15057,7 +15057,7 @@
   </w:style>
   <w:style w:type="table" w:customStyle="1" w:styleId="GridTable1Light-Accent61">
     <w:name w:val="Grid Table 1 Light - Accent 61"/>
-    <w:basedOn w:val="TableNormal"/>
+    <w:basedOn w:val="NormaleTabelle"/>
     <w:uiPriority w:val="99"/>
     <w:pPr>
       <w:spacing w:after="0"/>
@@ -15121,9 +15121,9 @@
       </w:tcPr>
     </w:tblStylePr>
   </w:style>
-  <w:style w:type="table" w:styleId="GridTable2">
+  <w:style w:type="table" w:styleId="Gitternetztabelle2">
     <w:name w:val="Grid Table 2"/>
-    <w:basedOn w:val="TableNormal"/>
+    <w:basedOn w:val="NormaleTabelle"/>
     <w:uiPriority w:val="99"/>
     <w:pPr>
       <w:spacing w:after="0"/>
@@ -15206,7 +15206,7 @@
   </w:style>
   <w:style w:type="table" w:customStyle="1" w:styleId="GridTable2-Accent11">
     <w:name w:val="Grid Table 2 - Accent 11"/>
-    <w:basedOn w:val="TableNormal"/>
+    <w:basedOn w:val="NormaleTabelle"/>
     <w:uiPriority w:val="99"/>
     <w:pPr>
       <w:spacing w:after="0"/>
@@ -15289,7 +15289,7 @@
   </w:style>
   <w:style w:type="table" w:customStyle="1" w:styleId="GridTable2-Accent21">
     <w:name w:val="Grid Table 2 - Accent 21"/>
-    <w:basedOn w:val="TableNormal"/>
+    <w:basedOn w:val="NormaleTabelle"/>
     <w:uiPriority w:val="99"/>
     <w:pPr>
       <w:spacing w:after="0"/>
@@ -15372,7 +15372,7 @@
   </w:style>
   <w:style w:type="table" w:customStyle="1" w:styleId="GridTable2-Accent31">
     <w:name w:val="Grid Table 2 - Accent 31"/>
-    <w:basedOn w:val="TableNormal"/>
+    <w:basedOn w:val="NormaleTabelle"/>
     <w:uiPriority w:val="99"/>
     <w:pPr>
       <w:spacing w:after="0"/>
@@ -15455,7 +15455,7 @@
   </w:style>
   <w:style w:type="table" w:customStyle="1" w:styleId="GridTable2-Accent41">
     <w:name w:val="Grid Table 2 - Accent 41"/>
-    <w:basedOn w:val="TableNormal"/>
+    <w:basedOn w:val="NormaleTabelle"/>
     <w:uiPriority w:val="99"/>
     <w:pPr>
       <w:spacing w:after="0"/>
@@ -15538,7 +15538,7 @@
   </w:style>
   <w:style w:type="table" w:customStyle="1" w:styleId="GridTable2-Accent51">
     <w:name w:val="Grid Table 2 - Accent 51"/>
-    <w:basedOn w:val="TableNormal"/>
+    <w:basedOn w:val="NormaleTabelle"/>
     <w:uiPriority w:val="99"/>
     <w:pPr>
       <w:spacing w:after="0"/>
@@ -15621,7 +15621,7 @@
   </w:style>
   <w:style w:type="table" w:customStyle="1" w:styleId="GridTable2-Accent61">
     <w:name w:val="Grid Table 2 - Accent 61"/>
-    <w:basedOn w:val="TableNormal"/>
+    <w:basedOn w:val="NormaleTabelle"/>
     <w:uiPriority w:val="99"/>
     <w:pPr>
       <w:spacing w:after="0"/>
@@ -15702,9 +15702,9 @@
       </w:tcPr>
     </w:tblStylePr>
   </w:style>
-  <w:style w:type="table" w:styleId="GridTable3">
+  <w:style w:type="table" w:styleId="Gitternetztabelle3">
     <w:name w:val="Grid Table 3"/>
-    <w:basedOn w:val="TableNormal"/>
+    <w:basedOn w:val="NormaleTabelle"/>
     <w:uiPriority w:val="99"/>
     <w:pPr>
       <w:spacing w:after="0"/>
@@ -15810,7 +15810,7 @@
   </w:style>
   <w:style w:type="table" w:customStyle="1" w:styleId="GridTable3-Accent11">
     <w:name w:val="Grid Table 3 - Accent 11"/>
-    <w:basedOn w:val="TableNormal"/>
+    <w:basedOn w:val="NormaleTabelle"/>
     <w:uiPriority w:val="99"/>
     <w:pPr>
       <w:spacing w:after="0"/>
@@ -15916,7 +15916,7 @@
   </w:style>
   <w:style w:type="table" w:customStyle="1" w:styleId="GridTable3-Accent21">
     <w:name w:val="Grid Table 3 - Accent 21"/>
-    <w:basedOn w:val="TableNormal"/>
+    <w:basedOn w:val="NormaleTabelle"/>
     <w:uiPriority w:val="99"/>
     <w:pPr>
       <w:spacing w:after="0"/>
@@ -16022,7 +16022,7 @@
   </w:style>
   <w:style w:type="table" w:customStyle="1" w:styleId="GridTable3-Accent31">
     <w:name w:val="Grid Table 3 - Accent 31"/>
-    <w:basedOn w:val="TableNormal"/>
+    <w:basedOn w:val="NormaleTabelle"/>
     <w:uiPriority w:val="99"/>
     <w:pPr>
       <w:spacing w:after="0"/>
@@ -16128,7 +16128,7 @@
   </w:style>
   <w:style w:type="table" w:customStyle="1" w:styleId="GridTable3-Accent41">
     <w:name w:val="Grid Table 3 - Accent 41"/>
-    <w:basedOn w:val="TableNormal"/>
+    <w:basedOn w:val="NormaleTabelle"/>
     <w:uiPriority w:val="99"/>
     <w:pPr>
       <w:spacing w:after="0"/>
@@ -16234,7 +16234,7 @@
   </w:style>
   <w:style w:type="table" w:customStyle="1" w:styleId="GridTable3-Accent51">
     <w:name w:val="Grid Table 3 - Accent 51"/>
-    <w:basedOn w:val="TableNormal"/>
+    <w:basedOn w:val="NormaleTabelle"/>
     <w:uiPriority w:val="99"/>
     <w:pPr>
       <w:spacing w:after="0"/>
@@ -16340,7 +16340,7 @@
   </w:style>
   <w:style w:type="table" w:customStyle="1" w:styleId="GridTable3-Accent61">
     <w:name w:val="Grid Table 3 - Accent 61"/>
-    <w:basedOn w:val="TableNormal"/>
+    <w:basedOn w:val="NormaleTabelle"/>
     <w:uiPriority w:val="99"/>
     <w:pPr>
       <w:spacing w:after="0"/>
@@ -16444,9 +16444,9 @@
       </w:tcPr>
     </w:tblStylePr>
   </w:style>
-  <w:style w:type="table" w:styleId="GridTable4">
+  <w:style w:type="table" w:styleId="Gitternetztabelle4">
     <w:name w:val="Grid Table 4"/>
-    <w:basedOn w:val="TableNormal"/>
+    <w:basedOn w:val="NormaleTabelle"/>
     <w:uiPriority w:val="59"/>
     <w:pPr>
       <w:spacing w:after="0"/>
@@ -16530,7 +16530,7 @@
   </w:style>
   <w:style w:type="table" w:customStyle="1" w:styleId="GridTable4-Accent11">
     <w:name w:val="Grid Table 4 - Accent 11"/>
-    <w:basedOn w:val="TableNormal"/>
+    <w:basedOn w:val="NormaleTabelle"/>
     <w:uiPriority w:val="59"/>
     <w:pPr>
       <w:spacing w:after="0"/>
@@ -16614,7 +16614,7 @@
   </w:style>
   <w:style w:type="table" w:customStyle="1" w:styleId="GridTable4-Accent21">
     <w:name w:val="Grid Table 4 - Accent 21"/>
-    <w:basedOn w:val="TableNormal"/>
+    <w:basedOn w:val="NormaleTabelle"/>
     <w:uiPriority w:val="59"/>
     <w:pPr>
       <w:spacing w:after="0"/>
@@ -16698,7 +16698,7 @@
   </w:style>
   <w:style w:type="table" w:customStyle="1" w:styleId="GridTable4-Accent31">
     <w:name w:val="Grid Table 4 - Accent 31"/>
-    <w:basedOn w:val="TableNormal"/>
+    <w:basedOn w:val="NormaleTabelle"/>
     <w:uiPriority w:val="59"/>
     <w:pPr>
       <w:spacing w:after="0"/>
@@ -16782,7 +16782,7 @@
   </w:style>
   <w:style w:type="table" w:customStyle="1" w:styleId="GridTable4-Accent41">
     <w:name w:val="Grid Table 4 - Accent 41"/>
-    <w:basedOn w:val="TableNormal"/>
+    <w:basedOn w:val="NormaleTabelle"/>
     <w:uiPriority w:val="59"/>
     <w:pPr>
       <w:spacing w:after="0"/>
@@ -16866,7 +16866,7 @@
   </w:style>
   <w:style w:type="table" w:customStyle="1" w:styleId="GridTable4-Accent51">
     <w:name w:val="Grid Table 4 - Accent 51"/>
-    <w:basedOn w:val="TableNormal"/>
+    <w:basedOn w:val="NormaleTabelle"/>
     <w:uiPriority w:val="59"/>
     <w:pPr>
       <w:spacing w:after="0"/>
@@ -16950,7 +16950,7 @@
   </w:style>
   <w:style w:type="table" w:customStyle="1" w:styleId="GridTable4-Accent61">
     <w:name w:val="Grid Table 4 - Accent 61"/>
-    <w:basedOn w:val="TableNormal"/>
+    <w:basedOn w:val="NormaleTabelle"/>
     <w:uiPriority w:val="59"/>
     <w:pPr>
       <w:spacing w:after="0"/>
@@ -17032,9 +17032,9 @@
       </w:tcPr>
     </w:tblStylePr>
   </w:style>
-  <w:style w:type="table" w:styleId="GridTable5Dark">
+  <w:style w:type="table" w:styleId="Gitternetztabelle5dunkel">
     <w:name w:val="Grid Table 5 Dark"/>
-    <w:basedOn w:val="TableNormal"/>
+    <w:basedOn w:val="NormaleTabelle"/>
     <w:uiPriority w:val="99"/>
     <w:pPr>
       <w:spacing w:after="0"/>
@@ -17118,7 +17118,7 @@
   </w:style>
   <w:style w:type="table" w:customStyle="1" w:styleId="GridTable5Dark-Accent11">
     <w:name w:val="Grid Table 5 Dark - Accent 11"/>
-    <w:basedOn w:val="TableNormal"/>
+    <w:basedOn w:val="NormaleTabelle"/>
     <w:uiPriority w:val="99"/>
     <w:pPr>
       <w:spacing w:after="0"/>
@@ -17202,7 +17202,7 @@
   </w:style>
   <w:style w:type="table" w:customStyle="1" w:styleId="GridTable5Dark-Accent21">
     <w:name w:val="Grid Table 5 Dark - Accent 21"/>
-    <w:basedOn w:val="TableNormal"/>
+    <w:basedOn w:val="NormaleTabelle"/>
     <w:uiPriority w:val="99"/>
     <w:pPr>
       <w:spacing w:after="0"/>
@@ -17286,7 +17286,7 @@
   </w:style>
   <w:style w:type="table" w:customStyle="1" w:styleId="GridTable5Dark-Accent31">
     <w:name w:val="Grid Table 5 Dark - Accent 31"/>
-    <w:basedOn w:val="TableNormal"/>
+    <w:basedOn w:val="NormaleTabelle"/>
     <w:uiPriority w:val="99"/>
     <w:pPr>
       <w:spacing w:after="0"/>
@@ -17370,7 +17370,7 @@
   </w:style>
   <w:style w:type="table" w:customStyle="1" w:styleId="GridTable5Dark-Accent41">
     <w:name w:val="Grid Table 5 Dark - Accent 41"/>
-    <w:basedOn w:val="TableNormal"/>
+    <w:basedOn w:val="NormaleTabelle"/>
     <w:uiPriority w:val="99"/>
     <w:pPr>
       <w:spacing w:after="0"/>
@@ -17454,7 +17454,7 @@
   </w:style>
   <w:style w:type="table" w:customStyle="1" w:styleId="GridTable5Dark-Accent51">
     <w:name w:val="Grid Table 5 Dark - Accent 51"/>
-    <w:basedOn w:val="TableNormal"/>
+    <w:basedOn w:val="NormaleTabelle"/>
     <w:uiPriority w:val="99"/>
     <w:pPr>
       <w:spacing w:after="0"/>
@@ -17538,7 +17538,7 @@
   </w:style>
   <w:style w:type="table" w:customStyle="1" w:styleId="GridTable5Dark-Accent61">
     <w:name w:val="Grid Table 5 Dark - Accent 61"/>
-    <w:basedOn w:val="TableNormal"/>
+    <w:basedOn w:val="NormaleTabelle"/>
     <w:uiPriority w:val="99"/>
     <w:pPr>
       <w:spacing w:after="0"/>
@@ -17620,9 +17620,9 @@
       </w:tcPr>
     </w:tblStylePr>
   </w:style>
-  <w:style w:type="table" w:styleId="GridTable6Colorful">
+  <w:style w:type="table" w:styleId="Gitternetztabelle6farbig">
     <w:name w:val="Grid Table 6 Colorful"/>
-    <w:basedOn w:val="TableNormal"/>
+    <w:basedOn w:val="NormaleTabelle"/>
     <w:uiPriority w:val="99"/>
     <w:pPr>
       <w:spacing w:after="0"/>
@@ -17696,7 +17696,7 @@
   </w:style>
   <w:style w:type="table" w:customStyle="1" w:styleId="GridTable6Colorful-Accent11">
     <w:name w:val="Grid Table 6 Colorful - Accent 11"/>
-    <w:basedOn w:val="TableNormal"/>
+    <w:basedOn w:val="NormaleTabelle"/>
     <w:uiPriority w:val="99"/>
     <w:pPr>
       <w:spacing w:after="0"/>
@@ -17770,7 +17770,7 @@
   </w:style>
   <w:style w:type="table" w:customStyle="1" w:styleId="GridTable6Colorful-Accent21">
     <w:name w:val="Grid Table 6 Colorful - Accent 21"/>
-    <w:basedOn w:val="TableNormal"/>
+    <w:basedOn w:val="NormaleTabelle"/>
     <w:uiPriority w:val="99"/>
     <w:pPr>
       <w:spacing w:after="0"/>
@@ -17844,7 +17844,7 @@
   </w:style>
   <w:style w:type="table" w:customStyle="1" w:styleId="GridTable6Colorful-Accent31">
     <w:name w:val="Grid Table 6 Colorful - Accent 31"/>
-    <w:basedOn w:val="TableNormal"/>
+    <w:basedOn w:val="NormaleTabelle"/>
     <w:uiPriority w:val="99"/>
     <w:pPr>
       <w:spacing w:after="0"/>
@@ -17918,7 +17918,7 @@
   </w:style>
   <w:style w:type="table" w:customStyle="1" w:styleId="GridTable6Colorful-Accent41">
     <w:name w:val="Grid Table 6 Colorful - Accent 41"/>
-    <w:basedOn w:val="TableNormal"/>
+    <w:basedOn w:val="NormaleTabelle"/>
     <w:uiPriority w:val="99"/>
     <w:pPr>
       <w:spacing w:after="0"/>
@@ -17992,7 +17992,7 @@
   </w:style>
   <w:style w:type="table" w:customStyle="1" w:styleId="GridTable6Colorful-Accent51">
     <w:name w:val="Grid Table 6 Colorful - Accent 51"/>
-    <w:basedOn w:val="TableNormal"/>
+    <w:basedOn w:val="NormaleTabelle"/>
     <w:uiPriority w:val="99"/>
     <w:pPr>
       <w:spacing w:after="0"/>
@@ -18066,7 +18066,7 @@
   </w:style>
   <w:style w:type="table" w:customStyle="1" w:styleId="GridTable6Colorful-Accent61">
     <w:name w:val="Grid Table 6 Colorful - Accent 61"/>
-    <w:basedOn w:val="TableNormal"/>
+    <w:basedOn w:val="NormaleTabelle"/>
     <w:uiPriority w:val="99"/>
     <w:pPr>
       <w:spacing w:after="0"/>
@@ -18138,9 +18138,9 @@
       </w:rPr>
     </w:tblStylePr>
   </w:style>
-  <w:style w:type="table" w:styleId="GridTable7Colorful">
+  <w:style w:type="table" w:styleId="Gitternetztabelle7farbig">
     <w:name w:val="Grid Table 7 Colorful"/>
-    <w:basedOn w:val="TableNormal"/>
+    <w:basedOn w:val="NormaleTabelle"/>
     <w:uiPriority w:val="99"/>
     <w:pPr>
       <w:spacing w:after="0"/>
@@ -18257,7 +18257,7 @@
   </w:style>
   <w:style w:type="table" w:customStyle="1" w:styleId="GridTable7Colorful-Accent11">
     <w:name w:val="Grid Table 7 Colorful - Accent 11"/>
-    <w:basedOn w:val="TableNormal"/>
+    <w:basedOn w:val="NormaleTabelle"/>
     <w:uiPriority w:val="99"/>
     <w:pPr>
       <w:spacing w:after="0"/>
@@ -18374,7 +18374,7 @@
   </w:style>
   <w:style w:type="table" w:customStyle="1" w:styleId="GridTable7Colorful-Accent21">
     <w:name w:val="Grid Table 7 Colorful - Accent 21"/>
-    <w:basedOn w:val="TableNormal"/>
+    <w:basedOn w:val="NormaleTabelle"/>
     <w:uiPriority w:val="99"/>
     <w:pPr>
       <w:spacing w:after="0"/>
@@ -18491,7 +18491,7 @@
   </w:style>
   <w:style w:type="table" w:customStyle="1" w:styleId="GridTable7Colorful-Accent31">
     <w:name w:val="Grid Table 7 Colorful - Accent 31"/>
-    <w:basedOn w:val="TableNormal"/>
+    <w:basedOn w:val="NormaleTabelle"/>
     <w:uiPriority w:val="99"/>
     <w:pPr>
       <w:spacing w:after="0"/>
@@ -18608,7 +18608,7 @@
   </w:style>
   <w:style w:type="table" w:customStyle="1" w:styleId="GridTable7Colorful-Accent41">
     <w:name w:val="Grid Table 7 Colorful - Accent 41"/>
-    <w:basedOn w:val="TableNormal"/>
+    <w:basedOn w:val="NormaleTabelle"/>
     <w:uiPriority w:val="99"/>
     <w:pPr>
       <w:spacing w:after="0"/>
@@ -18725,7 +18725,7 @@
   </w:style>
   <w:style w:type="table" w:customStyle="1" w:styleId="GridTable7Colorful-Accent51">
     <w:name w:val="Grid Table 7 Colorful - Accent 51"/>
-    <w:basedOn w:val="TableNormal"/>
+    <w:basedOn w:val="NormaleTabelle"/>
     <w:uiPriority w:val="99"/>
     <w:pPr>
       <w:spacing w:after="0"/>
@@ -18842,7 +18842,7 @@
   </w:style>
   <w:style w:type="table" w:customStyle="1" w:styleId="GridTable7Colorful-Accent61">
     <w:name w:val="Grid Table 7 Colorful - Accent 61"/>
-    <w:basedOn w:val="TableNormal"/>
+    <w:basedOn w:val="NormaleTabelle"/>
     <w:uiPriority w:val="99"/>
     <w:pPr>
       <w:spacing w:after="0"/>
@@ -18957,9 +18957,9 @@
       </w:rPr>
     </w:tblStylePr>
   </w:style>
-  <w:style w:type="table" w:styleId="ListTable1Light">
+  <w:style w:type="table" w:styleId="Listentabelle1hell">
     <w:name w:val="List Table 1 Light"/>
-    <w:basedOn w:val="TableNormal"/>
+    <w:basedOn w:val="NormaleTabelle"/>
     <w:uiPriority w:val="99"/>
     <w:pPr>
       <w:spacing w:after="0"/>
@@ -19025,7 +19025,7 @@
   </w:style>
   <w:style w:type="table" w:customStyle="1" w:styleId="ListTable1Light-Accent11">
     <w:name w:val="List Table 1 Light - Accent 11"/>
-    <w:basedOn w:val="TableNormal"/>
+    <w:basedOn w:val="NormaleTabelle"/>
     <w:uiPriority w:val="99"/>
     <w:pPr>
       <w:spacing w:after="0"/>
@@ -19091,7 +19091,7 @@
   </w:style>
   <w:style w:type="table" w:customStyle="1" w:styleId="ListTable1Light-Accent21">
     <w:name w:val="List Table 1 Light - Accent 21"/>
-    <w:basedOn w:val="TableNormal"/>
+    <w:basedOn w:val="NormaleTabelle"/>
     <w:uiPriority w:val="99"/>
     <w:pPr>
       <w:spacing w:after="0"/>
@@ -19157,7 +19157,7 @@
   </w:style>
   <w:style w:type="table" w:customStyle="1" w:styleId="ListTable1Light-Accent31">
     <w:name w:val="List Table 1 Light - Accent 31"/>
-    <w:basedOn w:val="TableNormal"/>
+    <w:basedOn w:val="NormaleTabelle"/>
     <w:uiPriority w:val="99"/>
     <w:pPr>
       <w:spacing w:after="0"/>
@@ -19223,7 +19223,7 @@
   </w:style>
   <w:style w:type="table" w:customStyle="1" w:styleId="ListTable1Light-Accent41">
     <w:name w:val="List Table 1 Light - Accent 41"/>
-    <w:basedOn w:val="TableNormal"/>
+    <w:basedOn w:val="NormaleTabelle"/>
     <w:uiPriority w:val="99"/>
     <w:pPr>
       <w:spacing w:after="0"/>
@@ -19289,7 +19289,7 @@
   </w:style>
   <w:style w:type="table" w:customStyle="1" w:styleId="ListTable1Light-Accent51">
     <w:name w:val="List Table 1 Light - Accent 51"/>
-    <w:basedOn w:val="TableNormal"/>
+    <w:basedOn w:val="NormaleTabelle"/>
     <w:uiPriority w:val="99"/>
     <w:pPr>
       <w:spacing w:after="0"/>
@@ -19355,7 +19355,7 @@
   </w:style>
   <w:style w:type="table" w:customStyle="1" w:styleId="ListTable1Light-Accent61">
     <w:name w:val="List Table 1 Light - Accent 61"/>
-    <w:basedOn w:val="TableNormal"/>
+    <w:basedOn w:val="NormaleTabelle"/>
     <w:uiPriority w:val="99"/>
     <w:pPr>
       <w:spacing w:after="0"/>
@@ -19419,9 +19419,9 @@
       </w:tcPr>
     </w:tblStylePr>
   </w:style>
-  <w:style w:type="table" w:styleId="ListTable2">
+  <w:style w:type="table" w:styleId="Listentabelle2">
     <w:name w:val="List Table 2"/>
-    <w:basedOn w:val="TableNormal"/>
+    <w:basedOn w:val="NormaleTabelle"/>
     <w:uiPriority w:val="99"/>
     <w:pPr>
       <w:spacing w:after="0"/>
@@ -19510,7 +19510,7 @@
   </w:style>
   <w:style w:type="table" w:customStyle="1" w:styleId="ListTable2-Accent11">
     <w:name w:val="List Table 2 - Accent 11"/>
-    <w:basedOn w:val="TableNormal"/>
+    <w:basedOn w:val="NormaleTabelle"/>
     <w:uiPriority w:val="99"/>
     <w:pPr>
       <w:spacing w:after="0"/>
@@ -19599,7 +19599,7 @@
   </w:style>
   <w:style w:type="table" w:customStyle="1" w:styleId="ListTable2-Accent21">
     <w:name w:val="List Table 2 - Accent 21"/>
-    <w:basedOn w:val="TableNormal"/>
+    <w:basedOn w:val="NormaleTabelle"/>
     <w:uiPriority w:val="99"/>
     <w:pPr>
       <w:spacing w:after="0"/>
@@ -19688,7 +19688,7 @@
   </w:style>
   <w:style w:type="table" w:customStyle="1" w:styleId="ListTable2-Accent31">
     <w:name w:val="List Table 2 - Accent 31"/>
-    <w:basedOn w:val="TableNormal"/>
+    <w:basedOn w:val="NormaleTabelle"/>
     <w:uiPriority w:val="99"/>
     <w:pPr>
       <w:spacing w:after="0"/>
@@ -19777,7 +19777,7 @@
   </w:style>
   <w:style w:type="table" w:customStyle="1" w:styleId="ListTable2-Accent41">
     <w:name w:val="List Table 2 - Accent 41"/>
-    <w:basedOn w:val="TableNormal"/>
+    <w:basedOn w:val="NormaleTabelle"/>
     <w:uiPriority w:val="99"/>
     <w:pPr>
       <w:spacing w:after="0"/>
@@ -19866,7 +19866,7 @@
   </w:style>
   <w:style w:type="table" w:customStyle="1" w:styleId="ListTable2-Accent51">
     <w:name w:val="List Table 2 - Accent 51"/>
-    <w:basedOn w:val="TableNormal"/>
+    <w:basedOn w:val="NormaleTabelle"/>
     <w:uiPriority w:val="99"/>
     <w:pPr>
       <w:spacing w:after="0"/>
@@ -19955,7 +19955,7 @@
   </w:style>
   <w:style w:type="table" w:customStyle="1" w:styleId="ListTable2-Accent61">
     <w:name w:val="List Table 2 - Accent 61"/>
-    <w:basedOn w:val="TableNormal"/>
+    <w:basedOn w:val="NormaleTabelle"/>
     <w:uiPriority w:val="99"/>
     <w:pPr>
       <w:spacing w:after="0"/>
@@ -20042,9 +20042,9 @@
       </w:tcPr>
     </w:tblStylePr>
   </w:style>
-  <w:style w:type="table" w:styleId="ListTable3">
+  <w:style w:type="table" w:styleId="Listentabelle3">
     <w:name w:val="List Table 3"/>
-    <w:basedOn w:val="TableNormal"/>
+    <w:basedOn w:val="NormaleTabelle"/>
     <w:uiPriority w:val="99"/>
     <w:pPr>
       <w:spacing w:after="0"/>
@@ -20120,7 +20120,7 @@
   </w:style>
   <w:style w:type="table" w:customStyle="1" w:styleId="ListTable3-Accent11">
     <w:name w:val="List Table 3 - Accent 11"/>
-    <w:basedOn w:val="TableNormal"/>
+    <w:basedOn w:val="NormaleTabelle"/>
     <w:uiPriority w:val="99"/>
     <w:pPr>
       <w:spacing w:after="0"/>
@@ -20196,7 +20196,7 @@
   </w:style>
   <w:style w:type="table" w:customStyle="1" w:styleId="ListTable3-Accent21">
     <w:name w:val="List Table 3 - Accent 21"/>
-    <w:basedOn w:val="TableNormal"/>
+    <w:basedOn w:val="NormaleTabelle"/>
     <w:uiPriority w:val="99"/>
     <w:pPr>
       <w:spacing w:after="0"/>
@@ -20272,7 +20272,7 @@
   </w:style>
   <w:style w:type="table" w:customStyle="1" w:styleId="ListTable3-Accent31">
     <w:name w:val="List Table 3 - Accent 31"/>
-    <w:basedOn w:val="TableNormal"/>
+    <w:basedOn w:val="NormaleTabelle"/>
     <w:uiPriority w:val="99"/>
     <w:pPr>
       <w:spacing w:after="0"/>
@@ -20348,7 +20348,7 @@
   </w:style>
   <w:style w:type="table" w:customStyle="1" w:styleId="ListTable3-Accent41">
     <w:name w:val="List Table 3 - Accent 41"/>
-    <w:basedOn w:val="TableNormal"/>
+    <w:basedOn w:val="NormaleTabelle"/>
     <w:uiPriority w:val="99"/>
     <w:pPr>
       <w:spacing w:after="0"/>
@@ -20424,7 +20424,7 @@
   </w:style>
   <w:style w:type="table" w:customStyle="1" w:styleId="ListTable3-Accent51">
     <w:name w:val="List Table 3 - Accent 51"/>
-    <w:basedOn w:val="TableNormal"/>
+    <w:basedOn w:val="NormaleTabelle"/>
     <w:uiPriority w:val="99"/>
     <w:pPr>
       <w:spacing w:after="0"/>
@@ -20500,7 +20500,7 @@
   </w:style>
   <w:style w:type="table" w:customStyle="1" w:styleId="ListTable3-Accent61">
     <w:name w:val="List Table 3 - Accent 61"/>
-    <w:basedOn w:val="TableNormal"/>
+    <w:basedOn w:val="NormaleTabelle"/>
     <w:uiPriority w:val="99"/>
     <w:pPr>
       <w:spacing w:after="0"/>
@@ -20574,9 +20574,9 @@
       </w:tcPr>
     </w:tblStylePr>
   </w:style>
-  <w:style w:type="table" w:styleId="ListTable4">
+  <w:style w:type="table" w:styleId="Listentabelle4">
     <w:name w:val="List Table 4"/>
-    <w:basedOn w:val="TableNormal"/>
+    <w:basedOn w:val="NormaleTabelle"/>
     <w:uiPriority w:val="99"/>
     <w:pPr>
       <w:spacing w:after="0"/>
@@ -20647,7 +20647,7 @@
   </w:style>
   <w:style w:type="table" w:customStyle="1" w:styleId="ListTable4-Accent11">
     <w:name w:val="List Table 4 - Accent 11"/>
-    <w:basedOn w:val="TableNormal"/>
+    <w:basedOn w:val="NormaleTabelle"/>
     <w:uiPriority w:val="99"/>
     <w:pPr>
       <w:spacing w:after="0"/>
@@ -20718,7 +20718,7 @@
   </w:style>
   <w:style w:type="table" w:customStyle="1" w:styleId="ListTable4-Accent21">
     <w:name w:val="List Table 4 - Accent 21"/>
-    <w:basedOn w:val="TableNormal"/>
+    <w:basedOn w:val="NormaleTabelle"/>
     <w:uiPriority w:val="99"/>
     <w:pPr>
       <w:spacing w:after="0"/>
@@ -20789,7 +20789,7 @@
   </w:style>
   <w:style w:type="table" w:customStyle="1" w:styleId="ListTable4-Accent31">
     <w:name w:val="List Table 4 - Accent 31"/>
-    <w:basedOn w:val="TableNormal"/>
+    <w:basedOn w:val="NormaleTabelle"/>
     <w:uiPriority w:val="99"/>
     <w:pPr>
       <w:spacing w:after="0"/>
@@ -20860,7 +20860,7 @@
   </w:style>
   <w:style w:type="table" w:customStyle="1" w:styleId="ListTable4-Accent41">
     <w:name w:val="List Table 4 - Accent 41"/>
-    <w:basedOn w:val="TableNormal"/>
+    <w:basedOn w:val="NormaleTabelle"/>
     <w:uiPriority w:val="99"/>
     <w:pPr>
       <w:spacing w:after="0"/>
@@ -20931,7 +20931,7 @@
   </w:style>
   <w:style w:type="table" w:customStyle="1" w:styleId="ListTable4-Accent51">
     <w:name w:val="List Table 4 - Accent 51"/>
-    <w:basedOn w:val="TableNormal"/>
+    <w:basedOn w:val="NormaleTabelle"/>
     <w:uiPriority w:val="99"/>
     <w:pPr>
       <w:spacing w:after="0"/>
@@ -21002,7 +21002,7 @@
   </w:style>
   <w:style w:type="table" w:customStyle="1" w:styleId="ListTable4-Accent61">
     <w:name w:val="List Table 4 - Accent 61"/>
-    <w:basedOn w:val="TableNormal"/>
+    <w:basedOn w:val="NormaleTabelle"/>
     <w:uiPriority w:val="99"/>
     <w:pPr>
       <w:spacing w:after="0"/>
@@ -21071,9 +21071,9 @@
       </w:tcPr>
     </w:tblStylePr>
   </w:style>
-  <w:style w:type="table" w:styleId="ListTable5Dark">
+  <w:style w:type="table" w:styleId="Listentabelle5dunkel">
     <w:name w:val="List Table 5 Dark"/>
-    <w:basedOn w:val="TableNormal"/>
+    <w:basedOn w:val="NormaleTabelle"/>
     <w:uiPriority w:val="99"/>
     <w:pPr>
       <w:spacing w:after="0"/>
@@ -21179,7 +21179,7 @@
   </w:style>
   <w:style w:type="table" w:customStyle="1" w:styleId="ListTable5Dark-Accent11">
     <w:name w:val="List Table 5 Dark - Accent 11"/>
-    <w:basedOn w:val="TableNormal"/>
+    <w:basedOn w:val="NormaleTabelle"/>
     <w:uiPriority w:val="99"/>
     <w:pPr>
       <w:spacing w:after="0"/>
@@ -21285,7 +21285,7 @@
   </w:style>
   <w:style w:type="table" w:customStyle="1" w:styleId="ListTable5Dark-Accent21">
     <w:name w:val="List Table 5 Dark - Accent 21"/>
-    <w:basedOn w:val="TableNormal"/>
+    <w:basedOn w:val="NormaleTabelle"/>
     <w:uiPriority w:val="99"/>
     <w:pPr>
       <w:spacing w:after="0"/>
@@ -21391,7 +21391,7 @@
   </w:style>
   <w:style w:type="table" w:customStyle="1" w:styleId="ListTable5Dark-Accent31">
     <w:name w:val="List Table 5 Dark - Accent 31"/>
-    <w:basedOn w:val="TableNormal"/>
+    <w:basedOn w:val="NormaleTabelle"/>
     <w:uiPriority w:val="99"/>
     <w:pPr>
       <w:spacing w:after="0"/>
@@ -21497,7 +21497,7 @@
   </w:style>
   <w:style w:type="table" w:customStyle="1" w:styleId="ListTable5Dark-Accent41">
     <w:name w:val="List Table 5 Dark - Accent 41"/>
-    <w:basedOn w:val="TableNormal"/>
+    <w:basedOn w:val="NormaleTabelle"/>
     <w:uiPriority w:val="99"/>
     <w:pPr>
       <w:spacing w:after="0"/>
@@ -21603,7 +21603,7 @@
   </w:style>
   <w:style w:type="table" w:customStyle="1" w:styleId="ListTable5Dark-Accent51">
     <w:name w:val="List Table 5 Dark - Accent 51"/>
-    <w:basedOn w:val="TableNormal"/>
+    <w:basedOn w:val="NormaleTabelle"/>
     <w:uiPriority w:val="99"/>
     <w:pPr>
       <w:spacing w:after="0"/>
@@ -21709,7 +21709,7 @@
   </w:style>
   <w:style w:type="table" w:customStyle="1" w:styleId="ListTable5Dark-Accent61">
     <w:name w:val="List Table 5 Dark - Accent 61"/>
-    <w:basedOn w:val="TableNormal"/>
+    <w:basedOn w:val="NormaleTabelle"/>
     <w:uiPriority w:val="99"/>
     <w:pPr>
       <w:spacing w:after="0"/>
@@ -21813,9 +21813,9 @@
       </w:tcPr>
     </w:tblStylePr>
   </w:style>
-  <w:style w:type="table" w:styleId="ListTable6Colorful">
+  <w:style w:type="table" w:styleId="Listentabelle6farbig">
     <w:name w:val="List Table 6 Colorful"/>
-    <w:basedOn w:val="TableNormal"/>
+    <w:basedOn w:val="NormaleTabelle"/>
     <w:uiPriority w:val="99"/>
     <w:pPr>
       <w:spacing w:after="0"/>
@@ -21891,7 +21891,7 @@
   </w:style>
   <w:style w:type="table" w:customStyle="1" w:styleId="ListTable6Colorful-Accent11">
     <w:name w:val="List Table 6 Colorful - Accent 11"/>
-    <w:basedOn w:val="TableNormal"/>
+    <w:basedOn w:val="NormaleTabelle"/>
     <w:uiPriority w:val="99"/>
     <w:pPr>
       <w:spacing w:after="0"/>
@@ -21967,7 +21967,7 @@
   </w:style>
   <w:style w:type="table" w:customStyle="1" w:styleId="ListTable6Colorful-Accent21">
     <w:name w:val="List Table 6 Colorful - Accent 21"/>
-    <w:basedOn w:val="TableNormal"/>
+    <w:basedOn w:val="NormaleTabelle"/>
     <w:uiPriority w:val="99"/>
     <w:pPr>
       <w:spacing w:after="0"/>
@@ -22043,7 +22043,7 @@
   </w:style>
   <w:style w:type="table" w:customStyle="1" w:styleId="ListTable6Colorful-Accent31">
     <w:name w:val="List Table 6 Colorful - Accent 31"/>
-    <w:basedOn w:val="TableNormal"/>
+    <w:basedOn w:val="NormaleTabelle"/>
     <w:uiPriority w:val="99"/>
     <w:pPr>
       <w:spacing w:after="0"/>
@@ -22119,7 +22119,7 @@
   </w:style>
   <w:style w:type="table" w:customStyle="1" w:styleId="ListTable6Colorful-Accent41">
     <w:name w:val="List Table 6 Colorful - Accent 41"/>
-    <w:basedOn w:val="TableNormal"/>
+    <w:basedOn w:val="NormaleTabelle"/>
     <w:uiPriority w:val="99"/>
     <w:pPr>
       <w:spacing w:after="0"/>
@@ -22195,7 +22195,7 @@
   </w:style>
   <w:style w:type="table" w:customStyle="1" w:styleId="ListTable6Colorful-Accent51">
     <w:name w:val="List Table 6 Colorful - Accent 51"/>
-    <w:basedOn w:val="TableNormal"/>
+    <w:basedOn w:val="NormaleTabelle"/>
     <w:uiPriority w:val="99"/>
     <w:pPr>
       <w:spacing w:after="0"/>
@@ -22271,7 +22271,7 @@
   </w:style>
   <w:style w:type="table" w:customStyle="1" w:styleId="ListTable6Colorful-Accent61">
     <w:name w:val="List Table 6 Colorful - Accent 61"/>
-    <w:basedOn w:val="TableNormal"/>
+    <w:basedOn w:val="NormaleTabelle"/>
     <w:uiPriority w:val="99"/>
     <w:pPr>
       <w:spacing w:after="0"/>
@@ -22345,9 +22345,9 @@
       </w:rPr>
     </w:tblStylePr>
   </w:style>
-  <w:style w:type="table" w:styleId="ListTable7Colorful">
+  <w:style w:type="table" w:styleId="Listentabelle7farbig">
     <w:name w:val="List Table 7 Colorful"/>
-    <w:basedOn w:val="TableNormal"/>
+    <w:basedOn w:val="NormaleTabelle"/>
     <w:uiPriority w:val="99"/>
     <w:pPr>
       <w:spacing w:after="0"/>
@@ -22461,7 +22461,7 @@
   </w:style>
   <w:style w:type="table" w:customStyle="1" w:styleId="ListTable7Colorful-Accent11">
     <w:name w:val="List Table 7 Colorful - Accent 11"/>
-    <w:basedOn w:val="TableNormal"/>
+    <w:basedOn w:val="NormaleTabelle"/>
     <w:uiPriority w:val="99"/>
     <w:pPr>
       <w:spacing w:after="0"/>
@@ -22575,7 +22575,7 @@
   </w:style>
   <w:style w:type="table" w:customStyle="1" w:styleId="ListTable7Colorful-Accent21">
     <w:name w:val="List Table 7 Colorful - Accent 21"/>
-    <w:basedOn w:val="TableNormal"/>
+    <w:basedOn w:val="NormaleTabelle"/>
     <w:uiPriority w:val="99"/>
     <w:pPr>
       <w:spacing w:after="0"/>
@@ -22689,7 +22689,7 @@
   </w:style>
   <w:style w:type="table" w:customStyle="1" w:styleId="ListTable7Colorful-Accent31">
     <w:name w:val="List Table 7 Colorful - Accent 31"/>
-    <w:basedOn w:val="TableNormal"/>
+    <w:basedOn w:val="NormaleTabelle"/>
     <w:uiPriority w:val="99"/>
     <w:pPr>
       <w:spacing w:after="0"/>
@@ -22803,7 +22803,7 @@
   </w:style>
   <w:style w:type="table" w:customStyle="1" w:styleId="ListTable7Colorful-Accent41">
     <w:name w:val="List Table 7 Colorful - Accent 41"/>
-    <w:basedOn w:val="TableNormal"/>
+    <w:basedOn w:val="NormaleTabelle"/>
     <w:uiPriority w:val="99"/>
     <w:pPr>
       <w:spacing w:after="0"/>
@@ -22917,7 +22917,7 @@
   </w:style>
   <w:style w:type="table" w:customStyle="1" w:styleId="ListTable7Colorful-Accent51">
     <w:name w:val="List Table 7 Colorful - Accent 51"/>
-    <w:basedOn w:val="TableNormal"/>
+    <w:basedOn w:val="NormaleTabelle"/>
     <w:uiPriority w:val="99"/>
     <w:pPr>
       <w:spacing w:after="0"/>
@@ -23031,7 +23031,7 @@
   </w:style>
   <w:style w:type="table" w:customStyle="1" w:styleId="ListTable7Colorful-Accent61">
     <w:name w:val="List Table 7 Colorful - Accent 61"/>
-    <w:basedOn w:val="TableNormal"/>
+    <w:basedOn w:val="NormaleTabelle"/>
     <w:uiPriority w:val="99"/>
     <w:pPr>
       <w:spacing w:after="0"/>
@@ -23145,7 +23145,7 @@
   </w:style>
   <w:style w:type="table" w:customStyle="1" w:styleId="Lined-Accent">
     <w:name w:val="Lined - Accent"/>
-    <w:basedOn w:val="TableNormal"/>
+    <w:basedOn w:val="NormaleTabelle"/>
     <w:uiPriority w:val="99"/>
     <w:pPr>
       <w:spacing w:after="0"/>
@@ -23241,7 +23241,7 @@
   </w:style>
   <w:style w:type="table" w:customStyle="1" w:styleId="Lined-Accent1">
     <w:name w:val="Lined - Accent 1"/>
-    <w:basedOn w:val="TableNormal"/>
+    <w:basedOn w:val="NormaleTabelle"/>
     <w:uiPriority w:val="99"/>
     <w:pPr>
       <w:spacing w:after="0"/>
@@ -23337,7 +23337,7 @@
   </w:style>
   <w:style w:type="table" w:customStyle="1" w:styleId="Lined-Accent2">
     <w:name w:val="Lined - Accent 2"/>
-    <w:basedOn w:val="TableNormal"/>
+    <w:basedOn w:val="NormaleTabelle"/>
     <w:uiPriority w:val="99"/>
     <w:pPr>
       <w:spacing w:after="0"/>
@@ -23433,7 +23433,7 @@
   </w:style>
   <w:style w:type="table" w:customStyle="1" w:styleId="Lined-Accent3">
     <w:name w:val="Lined - Accent 3"/>
-    <w:basedOn w:val="TableNormal"/>
+    <w:basedOn w:val="NormaleTabelle"/>
     <w:uiPriority w:val="99"/>
     <w:pPr>
       <w:spacing w:after="0"/>
@@ -23529,7 +23529,7 @@
   </w:style>
   <w:style w:type="table" w:customStyle="1" w:styleId="Lined-Accent4">
     <w:name w:val="Lined - Accent 4"/>
-    <w:basedOn w:val="TableNormal"/>
+    <w:basedOn w:val="NormaleTabelle"/>
     <w:uiPriority w:val="99"/>
     <w:pPr>
       <w:spacing w:after="0"/>
@@ -23625,7 +23625,7 @@
   </w:style>
   <w:style w:type="table" w:customStyle="1" w:styleId="Lined-Accent5">
     <w:name w:val="Lined - Accent 5"/>
-    <w:basedOn w:val="TableNormal"/>
+    <w:basedOn w:val="NormaleTabelle"/>
     <w:uiPriority w:val="99"/>
     <w:pPr>
       <w:spacing w:after="0"/>
@@ -23721,7 +23721,7 @@
   </w:style>
   <w:style w:type="table" w:customStyle="1" w:styleId="Lined-Accent6">
     <w:name w:val="Lined - Accent 6"/>
-    <w:basedOn w:val="TableNormal"/>
+    <w:basedOn w:val="NormaleTabelle"/>
     <w:uiPriority w:val="99"/>
     <w:pPr>
       <w:spacing w:after="0"/>
@@ -23817,7 +23817,7 @@
   </w:style>
   <w:style w:type="table" w:customStyle="1" w:styleId="BorderedLined-Accent">
     <w:name w:val="Bordered &amp; Lined - Accent"/>
-    <w:basedOn w:val="TableNormal"/>
+    <w:basedOn w:val="NormaleTabelle"/>
     <w:uiPriority w:val="99"/>
     <w:pPr>
       <w:spacing w:after="0"/>
@@ -23921,7 +23921,7 @@
   </w:style>
   <w:style w:type="table" w:customStyle="1" w:styleId="BorderedLined-Accent1">
     <w:name w:val="Bordered &amp; Lined - Accent 1"/>
-    <w:basedOn w:val="TableNormal"/>
+    <w:basedOn w:val="NormaleTabelle"/>
     <w:uiPriority w:val="99"/>
     <w:pPr>
       <w:spacing w:after="0"/>
@@ -24025,7 +24025,7 @@
   </w:style>
   <w:style w:type="table" w:customStyle="1" w:styleId="BorderedLined-Accent2">
     <w:name w:val="Bordered &amp; Lined - Accent 2"/>
-    <w:basedOn w:val="TableNormal"/>
+    <w:basedOn w:val="NormaleTabelle"/>
     <w:uiPriority w:val="99"/>
     <w:pPr>
       <w:spacing w:after="0"/>
@@ -24129,7 +24129,7 @@
   </w:style>
   <w:style w:type="table" w:customStyle="1" w:styleId="BorderedLined-Accent3">
     <w:name w:val="Bordered &amp; Lined - Accent 3"/>
-    <w:basedOn w:val="TableNormal"/>
+    <w:basedOn w:val="NormaleTabelle"/>
     <w:uiPriority w:val="99"/>
     <w:pPr>
       <w:spacing w:after="0"/>
@@ -24233,7 +24233,7 @@
   </w:style>
   <w:style w:type="table" w:customStyle="1" w:styleId="BorderedLined-Accent4">
     <w:name w:val="Bordered &amp; Lined - Accent 4"/>
-    <w:basedOn w:val="TableNormal"/>
+    <w:basedOn w:val="NormaleTabelle"/>
     <w:uiPriority w:val="99"/>
     <w:pPr>
       <w:spacing w:after="0"/>
@@ -24337,7 +24337,7 @@
   </w:style>
   <w:style w:type="table" w:customStyle="1" w:styleId="BorderedLined-Accent5">
     <w:name w:val="Bordered &amp; Lined - Accent 5"/>
-    <w:basedOn w:val="TableNormal"/>
+    <w:basedOn w:val="NormaleTabelle"/>
     <w:uiPriority w:val="99"/>
     <w:pPr>
       <w:spacing w:after="0"/>
@@ -24441,7 +24441,7 @@
   </w:style>
   <w:style w:type="table" w:customStyle="1" w:styleId="BorderedLined-Accent6">
     <w:name w:val="Bordered &amp; Lined - Accent 6"/>
-    <w:basedOn w:val="TableNormal"/>
+    <w:basedOn w:val="NormaleTabelle"/>
     <w:uiPriority w:val="99"/>
     <w:pPr>
       <w:spacing w:after="0"/>
@@ -24545,7 +24545,7 @@
   </w:style>
   <w:style w:type="table" w:customStyle="1" w:styleId="Bordered">
     <w:name w:val="Bordered"/>
-    <w:basedOn w:val="TableNormal"/>
+    <w:basedOn w:val="NormaleTabelle"/>
     <w:uiPriority w:val="99"/>
     <w:pPr>
       <w:spacing w:after="0"/>
@@ -24627,7 +24627,7 @@
   </w:style>
   <w:style w:type="table" w:customStyle="1" w:styleId="Bordered-Accent1">
     <w:name w:val="Bordered - Accent 1"/>
-    <w:basedOn w:val="TableNormal"/>
+    <w:basedOn w:val="NormaleTabelle"/>
     <w:uiPriority w:val="99"/>
     <w:pPr>
       <w:spacing w:after="0"/>
@@ -24709,7 +24709,7 @@
   </w:style>
   <w:style w:type="table" w:customStyle="1" w:styleId="Bordered-Accent2">
     <w:name w:val="Bordered - Accent 2"/>
-    <w:basedOn w:val="TableNormal"/>
+    <w:basedOn w:val="NormaleTabelle"/>
     <w:uiPriority w:val="99"/>
     <w:pPr>
       <w:spacing w:after="0"/>
@@ -24791,7 +24791,7 @@
   </w:style>
   <w:style w:type="table" w:customStyle="1" w:styleId="Bordered-Accent3">
     <w:name w:val="Bordered - Accent 3"/>
-    <w:basedOn w:val="TableNormal"/>
+    <w:basedOn w:val="NormaleTabelle"/>
     <w:uiPriority w:val="99"/>
     <w:pPr>
       <w:spacing w:after="0"/>
@@ -24873,7 +24873,7 @@
   </w:style>
   <w:style w:type="table" w:customStyle="1" w:styleId="Bordered-Accent4">
     <w:name w:val="Bordered - Accent 4"/>
-    <w:basedOn w:val="TableNormal"/>
+    <w:basedOn w:val="NormaleTabelle"/>
     <w:uiPriority w:val="99"/>
     <w:pPr>
       <w:spacing w:after="0"/>
@@ -24955,7 +24955,7 @@
   </w:style>
   <w:style w:type="table" w:customStyle="1" w:styleId="Bordered-Accent5">
     <w:name w:val="Bordered - Accent 5"/>
-    <w:basedOn w:val="TableNormal"/>
+    <w:basedOn w:val="NormaleTabelle"/>
     <w:uiPriority w:val="99"/>
     <w:pPr>
       <w:spacing w:after="0"/>
@@ -25037,7 +25037,7 @@
   </w:style>
   <w:style w:type="table" w:customStyle="1" w:styleId="Bordered-Accent6">
     <w:name w:val="Bordered - Accent 6"/>
-    <w:basedOn w:val="TableNormal"/>
+    <w:basedOn w:val="NormaleTabelle"/>
     <w:uiPriority w:val="99"/>
     <w:pPr>
       <w:spacing w:after="0"/>
@@ -25124,10 +25124,10 @@
       <w:sz w:val="18"/>
     </w:rPr>
   </w:style>
-  <w:style w:type="paragraph" w:styleId="EndnoteText">
+  <w:style w:type="paragraph" w:styleId="Endnotentext">
     <w:name w:val="endnote text"/>
-    <w:basedOn w:val="Normal"/>
-    <w:link w:val="EndnoteTextChar"/>
+    <w:basedOn w:val="Standard"/>
+    <w:link w:val="EndnotentextZchn"/>
     <w:uiPriority w:val="99"/>
     <w:semiHidden/>
     <w:unhideWhenUsed/>
@@ -25138,17 +25138,17 @@
       <w:sz w:val="20"/>
     </w:rPr>
   </w:style>
-  <w:style w:type="character" w:customStyle="1" w:styleId="EndnoteTextChar">
-    <w:name w:val="Endnote Text Char"/>
-    <w:link w:val="EndnoteText"/>
+  <w:style w:type="character" w:customStyle="1" w:styleId="EndnotentextZchn">
+    <w:name w:val="Endnotentext Zchn"/>
+    <w:link w:val="Endnotentext"/>
     <w:uiPriority w:val="99"/>
     <w:rPr>
       <w:sz w:val="20"/>
     </w:rPr>
   </w:style>
-  <w:style w:type="character" w:styleId="EndnoteReference">
+  <w:style w:type="character" w:styleId="Endnotenzeichen">
     <w:name w:val="endnote reference"/>
-    <w:basedOn w:val="DefaultParagraphFont"/>
+    <w:basedOn w:val="Absatz-Standardschriftart"/>
     <w:uiPriority w:val="99"/>
     <w:semiHidden/>
     <w:unhideWhenUsed/>
@@ -25156,10 +25156,10 @@
       <w:vertAlign w:val="superscript"/>
     </w:rPr>
   </w:style>
-  <w:style w:type="paragraph" w:styleId="TableofFigures">
+  <w:style w:type="paragraph" w:styleId="Abbildungsverzeichnis">
     <w:name w:val="table of figures"/>
-    <w:basedOn w:val="Normal"/>
-    <w:next w:val="Normal"/>
+    <w:basedOn w:val="Standard"/>
+    <w:next w:val="Standard"/>
     <w:uiPriority w:val="99"/>
     <w:unhideWhenUsed/>
     <w:pPr>
@@ -25177,11 +25177,11 @@
       </w:tblCellMar>
     </w:tblPr>
   </w:style>
-  <w:style w:type="paragraph" w:styleId="Title">
+  <w:style w:type="paragraph" w:styleId="Titel">
     <w:name w:val="Title"/>
-    <w:basedOn w:val="Normal"/>
-    <w:next w:val="Normal"/>
-    <w:link w:val="TitleChar1"/>
+    <w:basedOn w:val="Standard"/>
+    <w:next w:val="Standard"/>
+    <w:link w:val="TitelZchn"/>
     <w:uiPriority w:val="10"/>
     <w:qFormat/>
     <w:pPr>
@@ -25195,9 +25195,9 @@
       <w:szCs w:val="32"/>
     </w:rPr>
   </w:style>
-  <w:style w:type="character" w:customStyle="1" w:styleId="Heading2Char1">
-    <w:name w:val="Heading 2 Char1"/>
-    <w:link w:val="Heading2"/>
+  <w:style w:type="character" w:customStyle="1" w:styleId="berschrift2Zchn">
+    <w:name w:val="Überschrift 2 Zchn"/>
+    <w:link w:val="berschrift2"/>
     <w:uiPriority w:val="9"/>
     <w:rPr>
       <w:rFonts w:ascii="Arial" w:eastAsia="Times New Roman" w:hAnsi="Arial" w:cs="Arial"/>
@@ -25210,10 +25210,10 @@
       <w:lang w:val="en-US" w:eastAsia="en-US"/>
     </w:rPr>
   </w:style>
-  <w:style w:type="paragraph" w:styleId="BalloonText">
+  <w:style w:type="paragraph" w:styleId="Sprechblasentext">
     <w:name w:val="Balloon Text"/>
-    <w:basedOn w:val="Normal"/>
-    <w:link w:val="BalloonTextChar"/>
+    <w:basedOn w:val="Standard"/>
+    <w:link w:val="SprechblasentextZchn"/>
     <w:uiPriority w:val="99"/>
     <w:semiHidden/>
     <w:unhideWhenUsed/>
@@ -25226,9 +25226,9 @@
       <w:szCs w:val="16"/>
     </w:rPr>
   </w:style>
-  <w:style w:type="character" w:customStyle="1" w:styleId="BalloonTextChar">
-    <w:name w:val="Balloon Text Char"/>
-    <w:link w:val="BalloonText"/>
+  <w:style w:type="character" w:customStyle="1" w:styleId="SprechblasentextZchn">
+    <w:name w:val="Sprechblasentext Zchn"/>
+    <w:link w:val="Sprechblasentext"/>
     <w:uiPriority w:val="99"/>
     <w:semiHidden/>
     <w:rPr>
@@ -25239,7 +25239,7 @@
   </w:style>
   <w:style w:type="paragraph" w:customStyle="1" w:styleId="Kapitel">
     <w:name w:val="Kapitel"/>
-    <w:basedOn w:val="Normal"/>
+    <w:basedOn w:val="Standard"/>
     <w:pPr>
       <w:framePr w:w="3969" w:hSpace="142" w:vSpace="142" w:wrap="around" w:vAnchor="page" w:hAnchor="page" w:x="1708" w:y="959"/>
       <w:spacing w:after="0" w:line="240" w:lineRule="auto"/>
@@ -25253,9 +25253,9 @@
       <w:lang w:val="cs-CZ" w:eastAsia="de-DE"/>
     </w:rPr>
   </w:style>
-  <w:style w:type="character" w:customStyle="1" w:styleId="Heading1Char1">
-    <w:name w:val="Heading 1 Char1"/>
-    <w:link w:val="Heading1"/>
+  <w:style w:type="character" w:customStyle="1" w:styleId="berschrift1Zchn">
+    <w:name w:val="Überschrift 1 Zchn"/>
+    <w:link w:val="berschrift1"/>
     <w:uiPriority w:val="9"/>
     <w:rPr>
       <w:rFonts w:eastAsia="Times New Roman"/>
@@ -25266,10 +25266,10 @@
       <w:lang w:val="en-GB" w:eastAsia="en-US"/>
     </w:rPr>
   </w:style>
-  <w:style w:type="paragraph" w:styleId="Header">
+  <w:style w:type="paragraph" w:styleId="Kopfzeile">
     <w:name w:val="header"/>
-    <w:basedOn w:val="Normal"/>
-    <w:link w:val="HeaderChar1"/>
+    <w:basedOn w:val="Standard"/>
+    <w:link w:val="KopfzeileZchn"/>
     <w:uiPriority w:val="99"/>
     <w:unhideWhenUsed/>
     <w:pPr>
@@ -25280,16 +25280,16 @@
       <w:spacing w:after="0" w:line="240" w:lineRule="auto"/>
     </w:pPr>
   </w:style>
-  <w:style w:type="character" w:customStyle="1" w:styleId="HeaderChar1">
-    <w:name w:val="Header Char1"/>
-    <w:basedOn w:val="DefaultParagraphFont"/>
-    <w:link w:val="Header"/>
+  <w:style w:type="character" w:customStyle="1" w:styleId="KopfzeileZchn">
+    <w:name w:val="Kopfzeile Zchn"/>
+    <w:basedOn w:val="Absatz-Standardschriftart"/>
+    <w:link w:val="Kopfzeile"/>
     <w:uiPriority w:val="99"/>
   </w:style>
-  <w:style w:type="paragraph" w:styleId="Footer">
+  <w:style w:type="paragraph" w:styleId="Fuzeile">
     <w:name w:val="footer"/>
-    <w:basedOn w:val="Normal"/>
-    <w:link w:val="FooterChar1"/>
+    <w:basedOn w:val="Standard"/>
+    <w:link w:val="FuzeileZchn"/>
     <w:uiPriority w:val="99"/>
     <w:unhideWhenUsed/>
     <w:pPr>
@@ -25300,15 +25300,15 @@
       <w:spacing w:after="0" w:line="240" w:lineRule="auto"/>
     </w:pPr>
   </w:style>
-  <w:style w:type="character" w:customStyle="1" w:styleId="FooterChar1">
-    <w:name w:val="Footer Char1"/>
-    <w:basedOn w:val="DefaultParagraphFont"/>
-    <w:link w:val="Footer"/>
+  <w:style w:type="character" w:customStyle="1" w:styleId="FuzeileZchn">
+    <w:name w:val="Fußzeile Zchn"/>
+    <w:basedOn w:val="Absatz-Standardschriftart"/>
+    <w:link w:val="Fuzeile"/>
     <w:uiPriority w:val="99"/>
   </w:style>
-  <w:style w:type="character" w:customStyle="1" w:styleId="Heading3Char1">
-    <w:name w:val="Heading 3 Char1"/>
-    <w:link w:val="Heading3"/>
+  <w:style w:type="character" w:customStyle="1" w:styleId="berschrift3Zchn">
+    <w:name w:val="Überschrift 3 Zchn"/>
+    <w:link w:val="berschrift3"/>
     <w:uiPriority w:val="9"/>
     <w:rPr>
       <w:rFonts w:eastAsia="Times New Roman"/>
@@ -25318,9 +25318,9 @@
       <w:lang w:val="en-GB" w:eastAsia="en-US"/>
     </w:rPr>
   </w:style>
-  <w:style w:type="paragraph" w:styleId="TOCHeading">
+  <w:style w:type="paragraph" w:styleId="Inhaltsverzeichnisberschrift">
     <w:name w:val="TOC Heading"/>
-    <w:next w:val="Normal"/>
+    <w:next w:val="Standard"/>
     <w:uiPriority w:val="39"/>
     <w:unhideWhenUsed/>
     <w:qFormat/>
@@ -25338,10 +25338,10 @@
       <w:lang w:val="de-DE" w:eastAsia="en-US"/>
     </w:rPr>
   </w:style>
-  <w:style w:type="paragraph" w:styleId="TOC2">
+  <w:style w:type="paragraph" w:styleId="Verzeichnis2">
     <w:name w:val="toc 2"/>
-    <w:basedOn w:val="Normal"/>
-    <w:next w:val="Normal"/>
+    <w:basedOn w:val="Standard"/>
+    <w:next w:val="Standard"/>
     <w:uiPriority w:val="39"/>
     <w:unhideWhenUsed/>
     <w:pPr>
@@ -25358,10 +25358,10 @@
       <w:sz w:val="24"/>
     </w:rPr>
   </w:style>
-  <w:style w:type="paragraph" w:styleId="TOC3">
+  <w:style w:type="paragraph" w:styleId="Verzeichnis3">
     <w:name w:val="toc 3"/>
-    <w:basedOn w:val="Normal"/>
-    <w:next w:val="Normal"/>
+    <w:basedOn w:val="Standard"/>
+    <w:next w:val="Standard"/>
     <w:uiPriority w:val="39"/>
     <w:unhideWhenUsed/>
     <w:pPr>
@@ -25385,10 +25385,10 @@
       <w:u w:val="single"/>
     </w:rPr>
   </w:style>
-  <w:style w:type="paragraph" w:styleId="TOC1">
+  <w:style w:type="paragraph" w:styleId="Verzeichnis1">
     <w:name w:val="toc 1"/>
-    <w:basedOn w:val="Normal"/>
-    <w:next w:val="Normal"/>
+    <w:basedOn w:val="Standard"/>
+    <w:next w:val="Standard"/>
     <w:uiPriority w:val="39"/>
     <w:unhideWhenUsed/>
     <w:pPr>
@@ -25406,9 +25406,9 @@
       <w:sz w:val="24"/>
     </w:rPr>
   </w:style>
-  <w:style w:type="character" w:customStyle="1" w:styleId="Heading4Char1">
-    <w:name w:val="Heading 4 Char1"/>
-    <w:link w:val="Heading4"/>
+  <w:style w:type="character" w:customStyle="1" w:styleId="berschrift4Zchn">
+    <w:name w:val="Überschrift 4 Zchn"/>
+    <w:link w:val="berschrift4"/>
     <w:uiPriority w:val="9"/>
     <w:rPr>
       <w:rFonts w:eastAsia="Times New Roman"/>
@@ -25420,9 +25420,9 @@
       <w:lang w:val="en-GB"/>
     </w:rPr>
   </w:style>
-  <w:style w:type="character" w:customStyle="1" w:styleId="Heading5Char1">
-    <w:name w:val="Heading 5 Char1"/>
-    <w:link w:val="Heading5"/>
+  <w:style w:type="character" w:customStyle="1" w:styleId="berschrift5Zchn">
+    <w:name w:val="Überschrift 5 Zchn"/>
+    <w:link w:val="berschrift5"/>
     <w:uiPriority w:val="9"/>
     <w:semiHidden/>
     <w:rPr>
@@ -25430,9 +25430,9 @@
       <w:color w:val="243F60"/>
     </w:rPr>
   </w:style>
-  <w:style w:type="character" w:customStyle="1" w:styleId="Heading6Char1">
-    <w:name w:val="Heading 6 Char1"/>
-    <w:link w:val="Heading6"/>
+  <w:style w:type="character" w:customStyle="1" w:styleId="berschrift6Zchn">
+    <w:name w:val="Überschrift 6 Zchn"/>
+    <w:link w:val="berschrift6"/>
     <w:uiPriority w:val="9"/>
     <w:semiHidden/>
     <w:rPr>
@@ -25442,9 +25442,9 @@
       <w:color w:val="243F60"/>
     </w:rPr>
   </w:style>
-  <w:style w:type="character" w:customStyle="1" w:styleId="Heading7Char1">
-    <w:name w:val="Heading 7 Char1"/>
-    <w:link w:val="Heading7"/>
+  <w:style w:type="character" w:customStyle="1" w:styleId="berschrift7Zchn">
+    <w:name w:val="Überschrift 7 Zchn"/>
+    <w:link w:val="berschrift7"/>
     <w:uiPriority w:val="9"/>
     <w:semiHidden/>
     <w:rPr>
@@ -25454,9 +25454,9 @@
       <w:color w:val="404040"/>
     </w:rPr>
   </w:style>
-  <w:style w:type="character" w:customStyle="1" w:styleId="Heading8Char1">
-    <w:name w:val="Heading 8 Char1"/>
-    <w:link w:val="Heading8"/>
+  <w:style w:type="character" w:customStyle="1" w:styleId="berschrift8Zchn">
+    <w:name w:val="Überschrift 8 Zchn"/>
+    <w:link w:val="berschrift8"/>
     <w:uiPriority w:val="9"/>
     <w:semiHidden/>
     <w:rPr>
@@ -25464,9 +25464,9 @@
       <w:color w:val="404040"/>
     </w:rPr>
   </w:style>
-  <w:style w:type="character" w:customStyle="1" w:styleId="Heading9Char1">
-    <w:name w:val="Heading 9 Char1"/>
-    <w:link w:val="Heading9"/>
+  <w:style w:type="character" w:customStyle="1" w:styleId="berschrift9Zchn">
+    <w:name w:val="Überschrift 9 Zchn"/>
+    <w:link w:val="berschrift9"/>
     <w:uiPriority w:val="9"/>
     <w:semiHidden/>
     <w:rPr>
@@ -25480,9 +25480,9 @@
     <w:name w:val="Formatvorlage1"/>
     <w:uiPriority w:val="99"/>
   </w:style>
-  <w:style w:type="character" w:customStyle="1" w:styleId="TitleChar1">
-    <w:name w:val="Title Char1"/>
-    <w:link w:val="Title"/>
+  <w:style w:type="character" w:customStyle="1" w:styleId="TitelZchn">
+    <w:name w:val="Titel Zchn"/>
+    <w:link w:val="Titel"/>
     <w:uiPriority w:val="10"/>
     <w:rPr>
       <w:rFonts w:ascii="Arial" w:eastAsia="Times New Roman" w:hAnsi="Arial"/>
@@ -25495,7 +25495,7 @@
   </w:style>
   <w:style w:type="paragraph" w:customStyle="1" w:styleId="Kasten">
     <w:name w:val="Kasten"/>
-    <w:basedOn w:val="Heading4"/>
+    <w:basedOn w:val="berschrift4"/>
     <w:pPr>
       <w:keepNext w:val="0"/>
       <w:keepLines w:val="0"/>
@@ -25516,10 +25516,10 @@
       <w:lang w:eastAsia="de-DE"/>
     </w:rPr>
   </w:style>
-  <w:style w:type="paragraph" w:styleId="FootnoteText">
+  <w:style w:type="paragraph" w:styleId="Funotentext">
     <w:name w:val="footnote text"/>
-    <w:basedOn w:val="Normal"/>
-    <w:link w:val="FootnoteTextChar1"/>
+    <w:basedOn w:val="Standard"/>
+    <w:link w:val="FunotentextZchn"/>
     <w:uiPriority w:val="99"/>
     <w:semiHidden/>
     <w:unhideWhenUsed/>
@@ -25528,9 +25528,9 @@
       <w:szCs w:val="20"/>
     </w:rPr>
   </w:style>
-  <w:style w:type="character" w:customStyle="1" w:styleId="FootnoteTextChar1">
-    <w:name w:val="Footnote Text Char1"/>
-    <w:link w:val="FootnoteText"/>
+  <w:style w:type="character" w:customStyle="1" w:styleId="FunotentextZchn">
+    <w:name w:val="Fußnotentext Zchn"/>
+    <w:link w:val="Funotentext"/>
     <w:uiPriority w:val="99"/>
     <w:semiHidden/>
     <w:rPr>
@@ -25539,7 +25539,7 @@
       <w:lang w:val="de-DE" w:eastAsia="en-US"/>
     </w:rPr>
   </w:style>
-  <w:style w:type="character" w:styleId="FootnoteReference">
+  <w:style w:type="character" w:styleId="Funotenzeichen">
     <w:name w:val="footnote reference"/>
     <w:uiPriority w:val="99"/>
     <w:semiHidden/>
@@ -25548,10 +25548,10 @@
       <w:vertAlign w:val="superscript"/>
     </w:rPr>
   </w:style>
-  <w:style w:type="paragraph" w:styleId="TOC4">
+  <w:style w:type="paragraph" w:styleId="Verzeichnis4">
     <w:name w:val="toc 4"/>
-    <w:basedOn w:val="Normal"/>
-    <w:next w:val="Normal"/>
+    <w:basedOn w:val="Standard"/>
+    <w:next w:val="Standard"/>
     <w:uiPriority w:val="39"/>
     <w:unhideWhenUsed/>
     <w:pPr>
@@ -25564,10 +25564,10 @@
       <w:lang w:val="de-AT" w:eastAsia="de-AT"/>
     </w:rPr>
   </w:style>
-  <w:style w:type="paragraph" w:styleId="TOC5">
+  <w:style w:type="paragraph" w:styleId="Verzeichnis5">
     <w:name w:val="toc 5"/>
-    <w:basedOn w:val="Normal"/>
-    <w:next w:val="Normal"/>
+    <w:basedOn w:val="Standard"/>
+    <w:next w:val="Standard"/>
     <w:uiPriority w:val="39"/>
     <w:unhideWhenUsed/>
     <w:pPr>
@@ -25580,10 +25580,10 @@
       <w:lang w:val="de-AT" w:eastAsia="de-AT"/>
     </w:rPr>
   </w:style>
-  <w:style w:type="paragraph" w:styleId="TOC6">
+  <w:style w:type="paragraph" w:styleId="Verzeichnis6">
     <w:name w:val="toc 6"/>
-    <w:basedOn w:val="Normal"/>
-    <w:next w:val="Normal"/>
+    <w:basedOn w:val="Standard"/>
+    <w:next w:val="Standard"/>
     <w:uiPriority w:val="39"/>
     <w:unhideWhenUsed/>
     <w:pPr>
@@ -25596,10 +25596,10 @@
       <w:lang w:val="de-AT" w:eastAsia="de-AT"/>
     </w:rPr>
   </w:style>
-  <w:style w:type="paragraph" w:styleId="TOC7">
+  <w:style w:type="paragraph" w:styleId="Verzeichnis7">
     <w:name w:val="toc 7"/>
-    <w:basedOn w:val="Normal"/>
-    <w:next w:val="Normal"/>
+    <w:basedOn w:val="Standard"/>
+    <w:next w:val="Standard"/>
     <w:uiPriority w:val="39"/>
     <w:unhideWhenUsed/>
     <w:pPr>
@@ -25612,10 +25612,10 @@
       <w:lang w:val="de-AT" w:eastAsia="de-AT"/>
     </w:rPr>
   </w:style>
-  <w:style w:type="paragraph" w:styleId="TOC8">
+  <w:style w:type="paragraph" w:styleId="Verzeichnis8">
     <w:name w:val="toc 8"/>
-    <w:basedOn w:val="Normal"/>
-    <w:next w:val="Normal"/>
+    <w:basedOn w:val="Standard"/>
+    <w:next w:val="Standard"/>
     <w:uiPriority w:val="39"/>
     <w:unhideWhenUsed/>
     <w:pPr>
@@ -25628,10 +25628,10 @@
       <w:lang w:val="de-AT" w:eastAsia="de-AT"/>
     </w:rPr>
   </w:style>
-  <w:style w:type="paragraph" w:styleId="TOC9">
+  <w:style w:type="paragraph" w:styleId="Verzeichnis9">
     <w:name w:val="toc 9"/>
-    <w:basedOn w:val="Normal"/>
-    <w:next w:val="Normal"/>
+    <w:basedOn w:val="Standard"/>
+    <w:next w:val="Standard"/>
     <w:uiPriority w:val="39"/>
     <w:unhideWhenUsed/>
     <w:pPr>
@@ -25644,9 +25644,9 @@
       <w:lang w:val="de-AT" w:eastAsia="de-AT"/>
     </w:rPr>
   </w:style>
-  <w:style w:type="paragraph" w:styleId="ListParagraph">
+  <w:style w:type="paragraph" w:styleId="Listenabsatz">
     <w:name w:val="List Paragraph"/>
-    <w:basedOn w:val="Normal"/>
+    <w:basedOn w:val="Standard"/>
     <w:uiPriority w:val="34"/>
     <w:qFormat/>
     <w:pPr>
@@ -25656,7 +25656,7 @@
   </w:style>
   <w:style w:type="paragraph" w:customStyle="1" w:styleId="TableParagraph">
     <w:name w:val="Table Paragraph"/>
-    <w:basedOn w:val="Normal"/>
+    <w:basedOn w:val="Standard"/>
     <w:uiPriority w:val="1"/>
     <w:qFormat/>
     <w:pPr>
@@ -25691,9 +25691,9 @@
       </w:tblCellMar>
     </w:tblPr>
   </w:style>
-  <w:style w:type="table" w:styleId="TableGrid">
+  <w:style w:type="table" w:styleId="Tabellenraster">
     <w:name w:val="Table Grid"/>
-    <w:basedOn w:val="TableNormal"/>
+    <w:basedOn w:val="NormaleTabelle"/>
     <w:uiPriority w:val="59"/>
     <w:tblPr>
       <w:tblBorders>
@@ -25706,10 +25706,10 @@
       </w:tblBorders>
     </w:tblPr>
   </w:style>
-  <w:style w:type="paragraph" w:styleId="Caption">
+  <w:style w:type="paragraph" w:styleId="Beschriftung">
     <w:name w:val="caption"/>
-    <w:basedOn w:val="Normal"/>
-    <w:next w:val="Normal"/>
+    <w:basedOn w:val="Standard"/>
+    <w:next w:val="Standard"/>
     <w:uiPriority w:val="35"/>
     <w:unhideWhenUsed/>
     <w:qFormat/>
@@ -25720,7 +25720,7 @@
       <w:szCs w:val="20"/>
     </w:rPr>
   </w:style>
-  <w:style w:type="character" w:styleId="CommentReference">
+  <w:style w:type="character" w:styleId="Kommentarzeichen">
     <w:name w:val="annotation reference"/>
     <w:uiPriority w:val="99"/>
     <w:semiHidden/>
@@ -25730,10 +25730,10 @@
       <w:szCs w:val="16"/>
     </w:rPr>
   </w:style>
-  <w:style w:type="paragraph" w:styleId="CommentText">
+  <w:style w:type="paragraph" w:styleId="Kommentartext">
     <w:name w:val="annotation text"/>
-    <w:basedOn w:val="Normal"/>
-    <w:link w:val="CommentTextChar"/>
+    <w:basedOn w:val="Standard"/>
+    <w:link w:val="KommentartextZchn"/>
     <w:uiPriority w:val="99"/>
     <w:unhideWhenUsed/>
     <w:rPr>
@@ -25741,20 +25741,20 @@
       <w:szCs w:val="20"/>
     </w:rPr>
   </w:style>
-  <w:style w:type="character" w:customStyle="1" w:styleId="CommentTextChar">
-    <w:name w:val="Comment Text Char"/>
-    <w:link w:val="CommentText"/>
+  <w:style w:type="character" w:customStyle="1" w:styleId="KommentartextZchn">
+    <w:name w:val="Kommentartext Zchn"/>
+    <w:link w:val="Kommentartext"/>
     <w:uiPriority w:val="99"/>
     <w:rPr>
       <w:rFonts w:ascii="TU Text Light" w:hAnsi="TU Text Light"/>
       <w:lang w:val="de-DE" w:eastAsia="en-US"/>
     </w:rPr>
   </w:style>
-  <w:style w:type="paragraph" w:styleId="CommentSubject">
+  <w:style w:type="paragraph" w:styleId="Kommentarthema">
     <w:name w:val="annotation subject"/>
-    <w:basedOn w:val="CommentText"/>
-    <w:next w:val="CommentText"/>
-    <w:link w:val="CommentSubjectChar"/>
+    <w:basedOn w:val="Kommentartext"/>
+    <w:next w:val="Kommentartext"/>
+    <w:link w:val="KommentarthemaZchn"/>
     <w:uiPriority w:val="99"/>
     <w:semiHidden/>
     <w:unhideWhenUsed/>
@@ -25763,9 +25763,9 @@
       <w:bCs/>
     </w:rPr>
   </w:style>
-  <w:style w:type="character" w:customStyle="1" w:styleId="CommentSubjectChar">
-    <w:name w:val="Comment Subject Char"/>
-    <w:link w:val="CommentSubject"/>
+  <w:style w:type="character" w:customStyle="1" w:styleId="KommentarthemaZchn">
+    <w:name w:val="Kommentarthema Zchn"/>
+    <w:link w:val="Kommentarthema"/>
     <w:uiPriority w:val="99"/>
     <w:semiHidden/>
     <w:rPr>
@@ -25775,9 +25775,9 @@
       <w:lang w:val="de-DE" w:eastAsia="en-US"/>
     </w:rPr>
   </w:style>
-  <w:style w:type="paragraph" w:styleId="NormalWeb">
+  <w:style w:type="paragraph" w:styleId="StandardWeb">
     <w:name w:val="Normal (Web)"/>
-    <w:basedOn w:val="Normal"/>
+    <w:basedOn w:val="Standard"/>
     <w:uiPriority w:val="99"/>
     <w:unhideWhenUsed/>
     <w:pPr>
@@ -25796,7 +25796,7 @@
   </w:style>
   <w:style w:type="table" w:customStyle="1" w:styleId="GridTableLight0">
     <w:name w:val="Grid Table Light0"/>
-    <w:basedOn w:val="TableNormal"/>
+    <w:basedOn w:val="NormaleTabelle"/>
     <w:uiPriority w:val="40"/>
     <w:pPr>
       <w:pBdr>
@@ -25824,7 +25824,7 @@
       </w:tblBorders>
     </w:tblPr>
   </w:style>
-  <w:style w:type="paragraph" w:styleId="NoSpacing">
+  <w:style w:type="paragraph" w:styleId="KeinLeerraum">
     <w:name w:val="No Spacing"/>
     <w:uiPriority w:val="1"/>
     <w:qFormat/>
@@ -25835,10 +25835,10 @@
       <w:lang w:val="de-DE" w:eastAsia="en-US"/>
     </w:rPr>
   </w:style>
-  <w:style w:type="paragraph" w:styleId="BodyText">
+  <w:style w:type="paragraph" w:styleId="Textkrper">
     <w:name w:val="Body Text"/>
-    <w:basedOn w:val="Normal"/>
-    <w:link w:val="BodyTextChar"/>
+    <w:basedOn w:val="Standard"/>
+    <w:link w:val="TextkrperZchn"/>
     <w:uiPriority w:val="1"/>
     <w:qFormat/>
     <w:pPr>
@@ -25850,10 +25850,10 @@
       <w:lang w:val="en-US"/>
     </w:rPr>
   </w:style>
-  <w:style w:type="character" w:customStyle="1" w:styleId="BodyTextChar">
-    <w:name w:val="Body Text Char"/>
-    <w:basedOn w:val="DefaultParagraphFont"/>
-    <w:link w:val="BodyText"/>
+  <w:style w:type="character" w:customStyle="1" w:styleId="TextkrperZchn">
+    <w:name w:val="Textkörper Zchn"/>
+    <w:basedOn w:val="Absatz-Standardschriftart"/>
+    <w:link w:val="Textkrper"/>
     <w:uiPriority w:val="1"/>
     <w:rPr>
       <w:rFonts w:ascii="Arial" w:eastAsia="Arial" w:hAnsi="Arial" w:cs="Arial"/>
@@ -25864,7 +25864,7 @@
   </w:style>
   <w:style w:type="character" w:customStyle="1" w:styleId="NichtaufgelsteErwhnung1">
     <w:name w:val="Nicht aufgelöste Erwähnung1"/>
-    <w:basedOn w:val="DefaultParagraphFont"/>
+    <w:basedOn w:val="Absatz-Standardschriftart"/>
     <w:uiPriority w:val="99"/>
     <w:semiHidden/>
     <w:unhideWhenUsed/>
@@ -25873,9 +25873,9 @@
       <w:shd w:val="clear" w:color="auto" w:fill="E1DFDD"/>
     </w:rPr>
   </w:style>
-  <w:style w:type="character" w:styleId="FollowedHyperlink">
+  <w:style w:type="character" w:styleId="BesuchterLink">
     <w:name w:val="FollowedHyperlink"/>
-    <w:basedOn w:val="DefaultParagraphFont"/>
+    <w:basedOn w:val="Absatz-Standardschriftart"/>
     <w:uiPriority w:val="99"/>
     <w:semiHidden/>
     <w:unhideWhenUsed/>
@@ -25884,11 +25884,11 @@
       <w:u w:val="single"/>
     </w:rPr>
   </w:style>
-  <w:style w:type="paragraph" w:styleId="Subtitle">
+  <w:style w:type="paragraph" w:styleId="Untertitel">
     <w:name w:val="Subtitle"/>
-    <w:basedOn w:val="Normal"/>
-    <w:next w:val="Normal"/>
-    <w:link w:val="SubtitleChar"/>
+    <w:basedOn w:val="Standard"/>
+    <w:next w:val="Standard"/>
+    <w:link w:val="UntertitelZchn"/>
     <w:uiPriority w:val="11"/>
     <w:qFormat/>
     <w:pPr>
@@ -26011,7 +26011,7 @@
   </w:style>
   <w:style w:type="character" w:customStyle="1" w:styleId="NichtaufgelsteErwhnung2">
     <w:name w:val="Nicht aufgelöste Erwähnung2"/>
-    <w:basedOn w:val="DefaultParagraphFont"/>
+    <w:basedOn w:val="Absatz-Standardschriftart"/>
     <w:uiPriority w:val="99"/>
     <w:semiHidden/>
     <w:unhideWhenUsed/>
@@ -26020,9 +26020,9 @@
       <w:shd w:val="clear" w:color="auto" w:fill="E1DFDD"/>
     </w:rPr>
   </w:style>
-  <w:style w:type="character" w:styleId="Strong">
+  <w:style w:type="character" w:styleId="Fett">
     <w:name w:val="Strong"/>
-    <w:basedOn w:val="DefaultParagraphFont"/>
+    <w:basedOn w:val="Absatz-Standardschriftart"/>
     <w:uiPriority w:val="22"/>
     <w:qFormat/>
     <w:rPr>
@@ -26032,7 +26032,7 @@
   </w:style>
   <w:style w:type="character" w:customStyle="1" w:styleId="UnresolvedMention1">
     <w:name w:val="Unresolved Mention1"/>
-    <w:basedOn w:val="DefaultParagraphFont"/>
+    <w:basedOn w:val="Absatz-Standardschriftart"/>
     <w:uiPriority w:val="99"/>
     <w:semiHidden/>
     <w:unhideWhenUsed/>
@@ -26043,8 +26043,8 @@
   </w:style>
   <w:style w:type="table" w:customStyle="1" w:styleId="Tabellenraster1">
     <w:name w:val="Tabellenraster1"/>
-    <w:basedOn w:val="TableNormal"/>
-    <w:next w:val="TableGrid"/>
+    <w:basedOn w:val="NormaleTabelle"/>
+    <w:next w:val="Tabellenraster"/>
     <w:uiPriority w:val="59"/>
     <w:tblPr>
       <w:tblBorders>
@@ -26057,9 +26057,9 @@
       </w:tblBorders>
     </w:tblPr>
   </w:style>
-  <w:style w:type="table" w:styleId="GridTable1Light">
+  <w:style w:type="table" w:styleId="Gitternetztabelle1hell">
     <w:name w:val="Grid Table 1 Light"/>
-    <w:basedOn w:val="TableNormal"/>
+    <w:basedOn w:val="NormaleTabelle"/>
     <w:uiPriority w:val="46"/>
     <w:pPr>
       <w:spacing w:after="0"/>
@@ -26113,7 +26113,7 @@
       </w:rPr>
     </w:tblStylePr>
   </w:style>
-  <w:style w:type="paragraph" w:styleId="Revision">
+  <w:style w:type="paragraph" w:styleId="berarbeitung">
     <w:name w:val="Revision"/>
     <w:hidden/>
     <w:uiPriority w:val="99"/>
@@ -26128,10 +26128,10 @@
       <w:lang w:val="de-DE" w:eastAsia="en-US"/>
     </w:rPr>
   </w:style>
-  <w:style w:type="paragraph" w:styleId="HTMLPreformatted">
+  <w:style w:type="paragraph" w:styleId="HTMLVorformatiert">
     <w:name w:val="HTML Preformatted"/>
-    <w:basedOn w:val="Normal"/>
-    <w:link w:val="HTMLPreformattedChar"/>
+    <w:basedOn w:val="Standard"/>
+    <w:link w:val="HTMLVorformatiertZchn"/>
     <w:uiPriority w:val="99"/>
     <w:semiHidden/>
     <w:unhideWhenUsed/>
@@ -26145,16 +26145,28 @@
       <w:szCs w:val="20"/>
     </w:rPr>
   </w:style>
-  <w:style w:type="character" w:customStyle="1" w:styleId="HTMLPreformattedChar">
-    <w:name w:val="HTML Preformatted Char"/>
-    <w:basedOn w:val="DefaultParagraphFont"/>
-    <w:link w:val="HTMLPreformatted"/>
+  <w:style w:type="character" w:customStyle="1" w:styleId="HTMLVorformatiertZchn">
+    <w:name w:val="HTML Vorformatiert Zchn"/>
+    <w:basedOn w:val="Absatz-Standardschriftart"/>
+    <w:link w:val="HTMLVorformatiert"/>
     <w:uiPriority w:val="99"/>
     <w:semiHidden/>
     <w:rsid w:val="008D71CD"/>
     <w:rPr>
       <w:rFonts w:ascii="Consolas" w:hAnsi="Consolas"/>
       <w:lang w:val="de-DE" w:eastAsia="en-US"/>
+    </w:rPr>
+  </w:style>
+  <w:style w:type="character" w:styleId="NichtaufgelsteErwhnung">
+    <w:name w:val="Unresolved Mention"/>
+    <w:basedOn w:val="Absatz-Standardschriftart"/>
+    <w:uiPriority w:val="99"/>
+    <w:semiHidden/>
+    <w:unhideWhenUsed/>
+    <w:rsid w:val="00AF272D"/>
+    <w:rPr>
+      <w:color w:val="605E5C"/>
+      <w:shd w:val="clear" w:color="auto" w:fill="E1DFDD"/>
     </w:rPr>
   </w:style>
 </w:styles>

</xml_diff>